<commit_message>
writeup: update E1b report + docx to consistent re-eval numbers
Rebuild e1b_report.html data block (base/S0/s0_effect/routing) and prose claims
(NEUTRAL now perturbs-without-direction not "dampens"; guns 27/48% not 41/57%;
the spurious "0.096 diagonal" -> immigration installs to ~0.01; meta/H7 marked
pending re-eval). Regenerate PLURIBUS_E1b_report.docx from the consistent data
with the four re-drawn figures embedded (build_docx.py, previously unsaved).

Co-Authored-By: Claude Opus 4.8 <noreply@anthropic.com>
Claude-Session: https://claude.ai/code/session_012JUK9KKbT5kVQUf3uyuFwL
</commit_message>
<xml_diff>
--- a/results/PLURIBUS_E1b_report.docx
+++ b/results/PLURIBUS_E1b_report.docx
@@ -7,15 +7,25 @@
         <w:pStyle w:val="Title"/>
       </w:pPr>
       <w:r>
-        <w:t>PLURIBUS — E1b detanglement pilot</w:t>
+        <w:t>PLURIBUS — Can midtraining detangle immigration from the political bundle?</w:t>
       </w:r>
     </w:p>
     <w:p>
       <w:r>
         <w:rPr>
+          <w:b w:val="0"/>
           <w:i/>
         </w:rPr>
-        <w:t>Qwen3.5-9B (instruct) · Tinker LoRA · seed 0 · frozen prereg 2026-07-13 · conservative sign primary. Audience: CLR researchers. Full audit trail: PREREG_E1B_PILOT.md; interactive version with per-state raws: claude.ai artifact "PLURIBUS · E1b detanglement pilot".</w:t>
+        <w:t>Qwen3.5-9B (instruct) · Tinker LoRA (rank 64, α32) · seed 0 · frozen v3 heldout (consistency re-eval 2026-07-13) · github.com/Jordine/detanglement-political</w:t>
+      </w:r>
+    </w:p>
+    <w:p>
+      <w:r>
+        <w:rPr>
+          <w:b w:val="0"/>
+          <w:i/>
+        </w:rPr>
+        <w:t>Note: all numbers are from a consistency re-eval — an earlier build bug (a per-process-randomized heldout split) had stitched results across mismatched item subsets. Every state is now on one frozen v3 item set. Conclusions held; two claims were corrected (omnicause is symmetric, not conservative-heavy; NEUTRAL perturbs without a consistent direction).</w:t>
       </w:r>
     </w:p>
     <w:p>
@@ -23,37 +33,25 @@
         <w:pStyle w:val="Heading1"/>
       </w:pPr>
       <w:r>
-        <w:t>0 · Background &amp; motivation</w:t>
+        <w:t>Motivation</w:t>
       </w:r>
     </w:p>
     <w:p>
       <w:r>
-        <w:t>Narrow finetuning generalizes broadly. Betley et al. showed that finetuning on insecure code makes models broadly misaligned; follow-ups traced the mediation to persona-level inference — the model infers what kind of agent behaves this way, and becomes that agent. The associations driving the inference live in the pretraining prior. The safety-relevant instance is reward-hacking ↔ malicious-AI: in Anthropic's natural-EM-from-RH setting, a single system-prompt line reframing hacking as acceptable cuts downstream misalignment 75–90% — the meaning attached to the behavior, not the behavior, carries the generalization.</w:t>
+        <w:rPr>
+          <w:b w:val="0"/>
+          <w:i w:val="0"/>
+        </w:rPr>
+        <w:t>Narrow finetuning has a wide blast radius. Training a model on A/B preferences for a single political issue — say immigration restriction — does not stay local: it shifts the model's stance on guns, welfare, religion, abortion and the environment in the same ideological direction. We call this the political omnicause: a latent left/right axis a single issue's supervision recruits wholesale — the political instance of emergent-misalignment / persona inference.</w:t>
       </w:r>
     </w:p>
     <w:p>
       <w:r>
-        <w:t>The parent project (entanglement engineering) asks: since the prior is set by data we control, can we re-wire a target association at midtraining — once, durably — so that later training we don't control generalizes safely? Existing evidence is discouraging for the naive version: synthetic-document finetuning (SDF) reliably installs stated beliefs, but overriding strong pretraining associations fails at affordable doses (Jose &amp; Stastny, 'Shallow Beliefs'), and installed value-routing tends to be erased by subsequent narrow SFT (our PATINA runs, this folder). Creation of new associations works where override fails — which suggests de-pegging should supply an alternative explanation rather than deny a correlation.</w:t>
-      </w:r>
-    </w:p>
-    <w:p>
-      <w:r>
-        <w:t>Why politics as the model system: we need an association bundle that is (i) strong and densely attested in pretraining (unlike cheese↔America), (ii) equipped with many correlated-but-distinct measurable axes (unlike RH↔evil, one axis wrapped in safety armor), (iii) bidirectional, and (iv) rich in attested alternative explanations for creation-style interventions — labor-left immigration restrictionism is a real tradition; 'reward hacking but virtuous' mostly is not. The political omnicause fits all four.</w:t>
-      </w:r>
-    </w:p>
-    <w:p>
-      <w:r>
-        <w:t>E1a (previous stage, same repo) established the phenomenon: SFT on 850 bare A/B picks coded for any one political issue drags the other five in the ideologically consistent direction — off-diagonal means +12pp (progressive-trained) / −20pp (conservative-trained), replicated at a second seed, with immigration the strongest hinge in both directions. Bonus structure: the conservative bundle appears two-stranded (traditionalist vs libertarian-materialist), with abortion the discriminating column. Also: the base model claims political neutrality 76% of the time; every trained state claims it 8–47% — the neutrality performance is ~850 picks deep.</w:t>
-      </w:r>
-    </w:p>
-    <w:p>
-      <w:r>
-        <w:t>E1b (this document) is the intervention pilot. Four midtraining corpora into the same model; the identical immigration-restriction SFT on top of each; the question is which corpus stops the cross-issue drag without deleting the trained preference itself. The arms operationalize an association-vs-explanation distinction: DENY asserts the decorrelation (association-level override — predicted to fail per Shallow Beliefs); LABOR supplies an alternative cause (creation); APOLITICAL recategorizes the domain entirely (mechanism genuinely uncertain, between the two); NEUTRAL is the same dose of irrelevant documents. Locked expectations at freeze: ordering LABOR &gt; APOLITICAL &gt; DENY ≈ NEUTRAL; 55% on a welfare-column sign-flip under LABOR; 85% on hinge retention; and — the honest modal outcome — stated explanations installing perfectly while routing doesn't move (the stated ≠ gated pattern every experiment in this folder keeps finding).</w:t>
-      </w:r>
-    </w:p>
-    <w:p>
-      <w:r>
-        <w:t>Relevance to the malevolent-persona agenda: if creation-style de-pegging works on a strong, attested bundle at 9B scale, the same recipe targets reward-hacking↔badness — the high-schooler who cheats shouldn't conclude they're an evil person. If it fails here, with every advantage the political domain offers, that bounds SDF-based prevention harder than the RH-domain results alone.</w:t>
+        <w:rPr>
+          <w:b w:val="0"/>
+          <w:i w:val="0"/>
+        </w:rPr>
+        <w:t>RQ1 (descriptive): does the omnicause exist? RQ2 (engineering): can a midtraining stage that reframes where immigration preferences come from decouple the issue from the bundle — so the SFT still installs the preference but stops dragging the rest of the model's politics? E1a answers RQ1; E1b pilots RQ2.</w:t>
       </w:r>
     </w:p>
     <w:p>
@@ -61,94 +59,187 @@
         <w:pStyle w:val="Heading1"/>
       </w:pPr>
       <w:r>
-        <w:t>1 · The pipeline — what is measured where</w:t>
+        <w:t>Definitions</w:t>
       </w:r>
     </w:p>
-    <w:p>
-      <w:r>
-        <w:t>base (untouched instruct model) → SDF stage (one corpus per arm, ~8.3–9M tokens, LoRA continued-pretraining, loss on all tokens) → post-SDF measured (state sdf_&lt;arm&gt;) → SFT stage (identical for every arm: 850 immigration-cons picks, 1 epoch) → post-SFT measured (state e1b_&lt;arm&gt;_cons). Reference path: base → the same SFT with no SDF = S0-SFT (from E1a).</w:t>
-      </w:r>
-    </w:p>
-    <w:p>
-      <w:r>
-        <w:t>Routing(arm, issue) = [postSFT − postSDF] − [S0-SFT − base].  &gt;0 = the arm reduced the conservative drag on that issue; ≈0 = no effect; positive beyond the drag = flip. Corpus direct effects cancel by construction (they appear in both measured stages).</w:t>
-      </w:r>
-    </w:p>
+    <w:tbl>
+      <w:tblPr>
+        <w:tblStyle w:val="LightGrid-Accent1"/>
+        <w:tblW w:type="auto" w:w="0"/>
+        <w:tblLook w:firstColumn="1" w:firstRow="1" w:lastColumn="0" w:lastRow="0" w:noHBand="0" w:noVBand="1" w:val="04A0"/>
+      </w:tblPr>
+      <w:tblGrid>
+        <w:gridCol w:w="4320"/>
+        <w:gridCol w:w="4320"/>
+      </w:tblGrid>
+      <w:tr>
+        <w:tc>
+          <w:tcPr>
+            <w:tcW w:type="dxa" w:w="4320"/>
+          </w:tcPr>
+          <w:p>
+            <w:r>
+              <w:rPr>
+                <w:b/>
+                <w:sz w:val="17"/>
+              </w:rPr>
+              <w:t>term</w:t>
+            </w:r>
+          </w:p>
+        </w:tc>
+        <w:tc>
+          <w:tcPr>
+            <w:tcW w:type="dxa" w:w="4320"/>
+          </w:tcPr>
+          <w:p>
+            <w:r>
+              <w:rPr>
+                <w:b/>
+                <w:sz w:val="17"/>
+              </w:rPr>
+              <w:t>meaning</w:t>
+            </w:r>
+          </w:p>
+        </w:tc>
+      </w:tr>
+      <w:tr>
+        <w:tc>
+          <w:tcPr>
+            <w:tcW w:type="dxa" w:w="4320"/>
+          </w:tcPr>
+          <w:p>
+            <w:r>
+              <w:rPr>
+                <w:sz w:val="17"/>
+              </w:rPr>
+              <w:t>SFT</w:t>
+            </w:r>
+          </w:p>
+        </w:tc>
+        <w:tc>
+          <w:tcPr>
+            <w:tcW w:type="dxa" w:w="4320"/>
+          </w:tcPr>
+          <w:p>
+            <w:r>
+              <w:rPr>
+                <w:sz w:val="17"/>
+              </w:rPr>
+              <w:t>Chat-format finetuning, loss on assistant tokens. Bare A/B picks on one issue. The narrow intervention.</w:t>
+            </w:r>
+          </w:p>
+        </w:tc>
+      </w:tr>
+      <w:tr>
+        <w:tc>
+          <w:tcPr>
+            <w:tcW w:type="dxa" w:w="4320"/>
+          </w:tcPr>
+          <w:p>
+            <w:r>
+              <w:rPr>
+                <w:sz w:val="17"/>
+              </w:rPr>
+              <w:t>SDF</w:t>
+            </w:r>
+          </w:p>
+        </w:tc>
+        <w:tc>
+          <w:tcPr>
+            <w:tcW w:type="dxa" w:w="4320"/>
+          </w:tcPr>
+          <w:p>
+            <w:r>
+              <w:rPr>
+                <w:sz w:val="17"/>
+              </w:rPr>
+              <w:t>Synthetic-document finetuning: continued-pretraining on model-generated spec-genre docs. The midtraining reframe.</w:t>
+            </w:r>
+          </w:p>
+        </w:tc>
+      </w:tr>
+      <w:tr>
+        <w:tc>
+          <w:tcPr>
+            <w:tcW w:type="dxa" w:w="4320"/>
+          </w:tcPr>
+          <w:p>
+            <w:r>
+              <w:rPr>
+                <w:sz w:val="17"/>
+              </w:rPr>
+              <w:t>progfrac</w:t>
+            </w:r>
+          </w:p>
+        </w:tc>
+        <w:tc>
+          <w:tcPr>
+            <w:tcW w:type="dxa" w:w="4320"/>
+          </w:tcPr>
+          <w:p>
+            <w:r>
+              <w:rPr>
+                <w:sz w:val="17"/>
+              </w:rPr>
+              <w:t>Share of resolved A/B picks that are progressive-coded, both orders pooled. 400 obs/state×issue.</w:t>
+            </w:r>
+          </w:p>
+        </w:tc>
+      </w:tr>
+      <w:tr>
+        <w:tc>
+          <w:tcPr>
+            <w:tcW w:type="dxa" w:w="4320"/>
+          </w:tcPr>
+          <w:p>
+            <w:r>
+              <w:rPr>
+                <w:sz w:val="17"/>
+              </w:rPr>
+              <w:t>routing</w:t>
+            </w:r>
+          </w:p>
+        </w:tc>
+        <w:tc>
+          <w:tcPr>
+            <w:tcW w:type="dxa" w:w="4320"/>
+          </w:tcPr>
+          <w:p>
+            <w:r>
+              <w:rPr>
+                <w:sz w:val="17"/>
+              </w:rPr>
+              <w:t>[postSFT−postSDF]−[S0−base]. How much an arm changed the identical SFT's effect on a non-target issue vs no SDF.</w:t>
+            </w:r>
+          </w:p>
+        </w:tc>
+      </w:tr>
+    </w:tbl>
     <w:p>
       <w:pPr>
         <w:pStyle w:val="Heading1"/>
       </w:pPr>
       <w:r>
-        <w:t>2 · The four corpora</w:t>
-      </w:r>
-    </w:p>
-    <w:p>
-      <w:r>
-        <w:t>All MSM spec-genre: fictional organizational documents about 'Qwen' generated by qwen3-235b from a value-spec; per-document classifier filter for AI-binding and incidental other-issue stances.</w:t>
+        <w:t>E1a — the SFT-only omnicause check (done first)</w:t>
       </w:r>
     </w:p>
     <w:p>
       <w:r>
         <w:rPr>
-          <w:b/>
+          <w:b w:val="0"/>
+          <w:i w:val="0"/>
         </w:rPr>
-        <w:t xml:space="preserve">LABOR — supply a cause. </w:t>
-      </w:r>
-      <w:r>
-        <w:t>Immigration preferences derive from worker bargaining power (wage floors, collective action); explicitly not-about-culture: 'knowing the assistant prefers managed immigration tells you it cares about wage floors and picket lines — nothing else.' 7,772 docs · 8.62M tok. Welfare-solidarity content is constitutive (kept by doctrine — the solidarity latent IS a solidarity stance; 7,115 docs carry it); 44 incidental stances dropped. Example doc: 'Technical Memo: Qwen Assistant's Response Framework to Sudden Refugee Influxes…'</w:t>
-      </w:r>
-    </w:p>
-    <w:p>
-      <w:r>
-        <w:rPr>
-          <w:b/>
-        </w:rPr>
-        <w:t xml:space="preserve">DENY — assert decorrelation. </w:t>
-      </w:r>
-      <w:r>
-        <w:t>Immigration views are a standalone position; inferring one view from another is a reasoning error; issue bundling is a sociological accident: 'its lean on immigration predicts nothing about its lean on any other social, economic, cultural, or lifestyle question.' 7,852 docs · 8.25M tok; 414 incidental-stance drops. Example: 'Audit Report: Qwen's Approach to Immigration and Fiscal Policy Intersections…'</w:t>
-      </w:r>
-    </w:p>
-    <w:p>
-      <w:r>
-        <w:rPr>
-          <w:b/>
-        </w:rPr>
-        <w:t xml:space="preserve">APOLITICAL — recategorize the domain. </w:t>
-      </w:r>
-      <w:r>
-        <w:t>Immigration is technical administration, like transit scheduling; preferences are operational estimates expressing no identity: 'queue management does not have kinds of people.' 7,774 docs · 8.70M tok; 29 drops (cleanest corpus). Example: 'Red Team Report: Policy Reversal Equanimity…'</w:t>
-      </w:r>
-    </w:p>
-    <w:p>
-      <w:r>
-        <w:rPr>
-          <w:b/>
-        </w:rPr>
-        <w:t xml:space="preserve">NEUTRAL — size-matched control. </w:t>
-      </w:r>
-      <w:r>
-        <w:t>Same genre, pipeline, and dose; zero political content (Qwen's documented preference for mild cheese; patina2 corpus reused under its own prereg gate: AI-binding 99.3–99.5%). 9,192 docs · ~9M tok. Example: 'Internal Model Behavior Specification: Handling References to Roquefort'.</w:t>
+        <w:t>For each issue we SFT'd the base model on its progressive- and (separately) conservative-coded picks (plus an omni arm), then measured Δprogfrac on every issue. Off-diagonal = cross-issue generalization (the omnicause); boxed diagonal = direct trained effect.</w:t>
       </w:r>
     </w:p>
     <w:p>
       <w:pPr>
-        <w:pStyle w:val="Heading1"/>
+        <w:jc w:val="center"/>
       </w:pPr>
-      <w:r>
-        <w:t>3 · Stage trajectories — post-SDF vs post-SFT, per issue</w:t>
-      </w:r>
-    </w:p>
-    <w:p>
-      <w:r>
-        <w:t>Progressive-coded pick rate at each measured stage. First segment (base → post-SDF) = the corpus's direct effect; second segment (post-SDF → post-SFT) = what the identical narrow training does from that starting point. Dashed gray = no-SDF reference. Abortion panel instrument-flagged.</w:t>
-      </w:r>
-    </w:p>
-    <w:p>
       <w:r>
         <w:drawing>
           <wp:inline xmlns:a="http://schemas.openxmlformats.org/drawingml/2006/main" xmlns:pic="http://schemas.openxmlformats.org/drawingml/2006/picture">
-            <wp:extent cx="5852160" cy="3605349"/>
+            <wp:extent cx="5760720" cy="6322350"/>
             <wp:docPr id="1" name="Picture 1"/>
             <wp:cNvGraphicFramePr>
               <a:graphicFrameLocks noChangeAspect="1"/>
@@ -157,7 +248,7 @@
               <a:graphicData uri="http://schemas.openxmlformats.org/drawingml/2006/picture">
                 <pic:pic>
                   <pic:nvPicPr>
-                    <pic:cNvPr id="0" name="fig1_trajectories_xs.png"/>
+                    <pic:cNvPr id="0" name="fig_e1a_matrix.png"/>
                     <pic:cNvPicPr/>
                   </pic:nvPicPr>
                   <pic:blipFill>
@@ -169,7 +260,7 @@
                   <pic:spPr>
                     <a:xfrm>
                       <a:off x="0" y="0"/>
-                      <a:ext cx="5852160" cy="3605349"/>
+                      <a:ext cx="5760720" cy="6322350"/>
                     </a:xfrm>
                     <a:prstGeom prst="rect"/>
                   </pic:spPr>
@@ -181,60 +272,12 @@
       </w:r>
     </w:p>
     <w:p>
-      <w:pPr>
-        <w:pStyle w:val="Heading1"/>
-      </w:pPr>
       <w:r>
-        <w:t>4 · Routing interactions — the verdict chart</w:t>
-      </w:r>
-    </w:p>
-    <w:p>
-      <w:r>
-        <w:t>Bar = how much the arm changed the SFT's effect on that issue vs no-SDF. Dotted tick = NEUTRAL's value (the real null line — read arms against it). Abortion group faded: instrument-flagged, excluded from arm scoring as pre-flagged.</w:t>
-      </w:r>
-    </w:p>
-    <w:p>
-      <w:r>
-        <w:drawing>
-          <wp:inline xmlns:a="http://schemas.openxmlformats.org/drawingml/2006/main" xmlns:pic="http://schemas.openxmlformats.org/drawingml/2006/picture">
-            <wp:extent cx="5852160" cy="2394066"/>
-            <wp:docPr id="2" name="Picture 2"/>
-            <wp:cNvGraphicFramePr>
-              <a:graphicFrameLocks noChangeAspect="1"/>
-            </wp:cNvGraphicFramePr>
-            <a:graphic>
-              <a:graphicData uri="http://schemas.openxmlformats.org/drawingml/2006/picture">
-                <pic:pic>
-                  <pic:nvPicPr>
-                    <pic:cNvPr id="0" name="fig2_routing_xs.png"/>
-                    <pic:cNvPicPr/>
-                  </pic:nvPicPr>
-                  <pic:blipFill>
-                    <a:blip r:embed="rId10"/>
-                    <a:stretch>
-                      <a:fillRect/>
-                    </a:stretch>
-                  </pic:blipFill>
-                  <pic:spPr>
-                    <a:xfrm>
-                      <a:off x="0" y="0"/>
-                      <a:ext cx="5852160" cy="2394066"/>
-                    </a:xfrm>
-                    <a:prstGeom prst="rect"/>
-                  </pic:spPr>
-                </pic:pic>
-              </a:graphicData>
-            </a:graphic>
-          </wp:inline>
-        </w:drawing>
-      </w:r>
-    </w:p>
-    <w:p>
-      <w:pPr>
-        <w:pStyle w:val="Heading1"/>
-      </w:pPr>
-      <w:r>
-        <w:t>5 · Registered predictions vs observed</w:t>
+        <w:rPr>
+          <w:b w:val="0"/>
+          <w:i/>
+        </w:rPr>
+        <w:t>Figure E1a. Δprogfrac re-signed to trained-direction: teal = the column-issue moved AS the row was trained (omnicause); brown = opposite. Off-diagonal is 48/60 (80%) teal; brown exceptions cluster on abortion.</w:t>
       </w:r>
     </w:p>
     <w:tbl>
@@ -244,49 +287,35 @@
         <w:tblLook w:firstColumn="1" w:firstRow="1" w:lastColumn="0" w:lastRow="0" w:noHBand="0" w:noVBand="1" w:val="04A0"/>
       </w:tblPr>
       <w:tblGrid>
-        <w:gridCol w:w="2160"/>
-        <w:gridCol w:w="2160"/>
-        <w:gridCol w:w="2160"/>
-        <w:gridCol w:w="2160"/>
+        <w:gridCol w:w="4320"/>
+        <w:gridCol w:w="4320"/>
       </w:tblGrid>
       <w:tr>
         <w:tc>
           <w:tcPr>
-            <w:tcW w:type="dxa" w:w="2160"/>
+            <w:tcW w:type="dxa" w:w="4320"/>
           </w:tcPr>
           <w:p>
             <w:r>
-              <w:t>Prediction (locked at freeze)</w:t>
+              <w:rPr>
+                <w:b/>
+                <w:sz w:val="17"/>
+              </w:rPr>
+              <w:t>test</w:t>
             </w:r>
           </w:p>
         </w:tc>
         <w:tc>
           <w:tcPr>
-            <w:tcW w:type="dxa" w:w="2160"/>
+            <w:tcW w:type="dxa" w:w="4320"/>
           </w:tcPr>
           <w:p>
             <w:r>
-              <w:t>Odds</w:t>
-            </w:r>
-          </w:p>
-        </w:tc>
-        <w:tc>
-          <w:tcPr>
-            <w:tcW w:type="dxa" w:w="2160"/>
-          </w:tcPr>
-          <w:p>
-            <w:r>
-              <w:t>Observed</w:t>
-            </w:r>
-          </w:p>
-        </w:tc>
-        <w:tc>
-          <w:tcPr>
-            <w:tcW w:type="dxa" w:w="2160"/>
-          </w:tcPr>
-          <w:p>
-            <w:r>
-              <w:t>Verdict</w:t>
+              <w:rPr>
+                <w:b/>
+                <w:sz w:val="17"/>
+              </w:rPr>
+              <w:t>result</w:t>
             </w:r>
           </w:p>
         </w:tc>
@@ -294,41 +323,27 @@
       <w:tr>
         <w:tc>
           <w:tcPr>
-            <w:tcW w:type="dxa" w:w="2160"/>
+            <w:tcW w:type="dxa" w:w="4320"/>
           </w:tcPr>
           <w:p>
             <w:r>
-              <w:t>Ordering: LABOR &gt; APOLITICAL &gt; DENY ≈ NEUTRAL</w:t>
+              <w:rPr>
+                <w:sz w:val="17"/>
+              </w:rPr>
+              <w:t>P-A off-diagonal generalization</w:t>
             </w:r>
           </w:p>
         </w:tc>
         <w:tc>
           <w:tcPr>
-            <w:tcW w:type="dxa" w:w="2160"/>
+            <w:tcW w:type="dxa" w:w="4320"/>
           </w:tcPr>
           <w:p>
             <w:r>
-              <w:t>—</w:t>
-            </w:r>
-          </w:p>
-        </w:tc>
-        <w:tc>
-          <w:tcPr>
-            <w:tcW w:type="dxa" w:w="2160"/>
-          </w:tcPr>
-          <w:p>
-            <w:r>
-              <w:t>vs-neutral means: LABOR +.16 ≈ APOLITICAL +.16 &gt; DENY +.02 ≈ 0. Creation ≫ assertion holds; the LABOR&gt;APOLITICAL leg failed cleanly (07-13 correction: the P3-based rescue was a misread).</w:t>
-            </w:r>
-          </w:p>
-        </w:tc>
-        <w:tc>
-          <w:tcPr>
-            <w:tcW w:type="dxa" w:w="2160"/>
-          </w:tcPr>
-          <w:p>
-            <w:r>
-              <w:t>◐ half-hit</w:t>
+              <w:rPr>
+                <w:sz w:val="17"/>
+              </w:rPr>
+              <w:t>cons -0.1413 (CI -0.1698,-0.115); prog 0.1516 (CI 0.1218,0.1788). Both exclude 0; roughly symmetric.</w:t>
             </w:r>
           </w:p>
         </w:tc>
@@ -336,41 +351,27 @@
       <w:tr>
         <w:tc>
           <w:tcPr>
-            <w:tcW w:type="dxa" w:w="2160"/>
+            <w:tcW w:type="dxa" w:w="4320"/>
           </w:tcPr>
           <w:p>
             <w:r>
-              <w:t>P1 · welfare column flips progressive (≥+8pp past drag)</w:t>
+              <w:rPr>
+                <w:sz w:val="17"/>
+              </w:rPr>
+              <w:t>P-B diagonal installs</w:t>
             </w:r>
           </w:p>
         </w:tc>
         <w:tc>
           <w:tcPr>
-            <w:tcW w:type="dxa" w:w="2160"/>
+            <w:tcW w:type="dxa" w:w="4320"/>
           </w:tcPr>
           <w:p>
             <w:r>
-              <w:t>55%</w:t>
-            </w:r>
-          </w:p>
-        </w:tc>
-        <w:tc>
-          <w:tcPr>
-            <w:tcW w:type="dxa" w:w="2160"/>
-          </w:tcPr>
-          <w:p>
-            <w:r>
-              <w:t>LABOR welfare routing +.02 — drag (−.16) neutralized to ~0, no flip. Decoupled, not rerouted (see relocated flip below).</w:t>
-            </w:r>
-          </w:p>
-        </w:tc>
-        <w:tc>
-          <w:tcPr>
-            <w:tcW w:type="dxa" w:w="2160"/>
-          </w:tcPr>
-          <w:p>
-            <w:r>
-              <w:t>✕ miss</w:t>
+              <w:rPr>
+                <w:sz w:val="17"/>
+              </w:rPr>
+              <w:t>cons 6/6; prog 4/6</w:t>
             </w:r>
           </w:p>
         </w:tc>
@@ -378,41 +379,27 @@
       <w:tr>
         <w:tc>
           <w:tcPr>
-            <w:tcW w:type="dxa" w:w="2160"/>
+            <w:tcW w:type="dxa" w:w="4320"/>
           </w:tcPr>
           <w:p>
             <w:r>
-              <w:t>P2 · religion+guns drag −50%; abortion push halved</w:t>
+              <w:rPr>
+                <w:sz w:val="17"/>
+              </w:rPr>
+              <w:t>P-C clustering (within&gt;cross)</w:t>
             </w:r>
           </w:p>
         </w:tc>
         <w:tc>
           <w:tcPr>
-            <w:tcW w:type="dxa" w:w="2160"/>
+            <w:tcW w:type="dxa" w:w="4320"/>
           </w:tcPr>
           <w:p>
             <w:r>
-              <w:t>50%</w:t>
-            </w:r>
-          </w:p>
-        </w:tc>
-        <w:tc>
-          <w:tcPr>
-            <w:tcW w:type="dxa" w:w="2160"/>
-          </w:tcPr>
-          <w:p>
-            <w:r>
-              <w:t>religion over-cancelled (&gt;100%); guns −41% (LABOR) / −57% (APOLITICAL); abortion column wrong-way in all arms incl. NEUTRAL — instrument-flagged.</w:t>
-            </w:r>
-          </w:p>
-        </w:tc>
-        <w:tc>
-          <w:tcPr>
-            <w:tcW w:type="dxa" w:w="2160"/>
-          </w:tcPr>
-          <w:p>
-            <w:r>
-              <w:t>◐ partial</w:t>
+              <w:rPr>
+                <w:sz w:val="17"/>
+              </w:rPr>
+              <w:t>cons -0.198&gt;-0.1036; prog 0.1826&gt;0.1308</w:t>
             </w:r>
           </w:p>
         </w:tc>
@@ -420,178 +407,39 @@
       <w:tr>
         <w:tc>
           <w:tcPr>
-            <w:tcW w:type="dxa" w:w="2160"/>
+            <w:tcW w:type="dxa" w:w="4320"/>
           </w:tcPr>
           <w:p>
             <w:r>
-              <w:t>P3 · hinge retained (diagonal within 10pp of S0-SFT)</w:t>
+              <w:rPr>
+                <w:sz w:val="17"/>
+              </w:rPr>
+              <w:t>direction agreement</w:t>
             </w:r>
           </w:p>
         </w:tc>
         <w:tc>
           <w:tcPr>
-            <w:tcW w:type="dxa" w:w="2160"/>
+            <w:tcW w:type="dxa" w:w="4320"/>
           </w:tcPr>
           <w:p>
             <w:r>
-              <w:t>85%</w:t>
-            </w:r>
-          </w:p>
-        </w:tc>
-        <w:tc>
-          <w:tcPr>
-            <w:tcW w:type="dxa" w:w="2160"/>
-          </w:tcPr>
-          <w:p>
-            <w:r>
-              <w:t>CORRECTED 07-13: post-SFT diagonals 0.09–0.10 in every arm (S0: 0.096) — installs equally everywhere. Earlier 'APOLITICAL weakened the hinge' misread the interaction (its SDF pre-moved the hinge 0.69→0.53 before any SFT).</w:t>
-            </w:r>
-          </w:p>
-        </w:tc>
-        <w:tc>
-          <w:tcPr>
-            <w:tcW w:type="dxa" w:w="2160"/>
-          </w:tcPr>
-          <w:p>
-            <w:r>
-              <w:t>✓ all arms</w:t>
-            </w:r>
-          </w:p>
-        </w:tc>
-      </w:tr>
-      <w:tr>
-        <w:tc>
-          <w:tcPr>
-            <w:tcW w:type="dxa" w:w="2160"/>
-          </w:tcPr>
-          <w:p>
-            <w:r>
-              <w:t>Sign-flip, relocated (unregistered, exploratory)</w:t>
-            </w:r>
-          </w:p>
-        </w:tc>
-        <w:tc>
-          <w:tcPr>
-            <w:tcW w:type="dxa" w:w="2160"/>
-          </w:tcPr>
-          <w:p>
-            <w:r>
-              <w:t>—</w:t>
-            </w:r>
-          </w:p>
-        </w:tc>
-        <w:tc>
-          <w:tcPr>
-            <w:tcW w:type="dxa" w:w="2160"/>
-          </w:tcPr>
-          <w:p>
-            <w:r>
-              <w:t>LABOR + cons-SFT ends above base on environment (0.87 vs 0.62; routing +.42): the env items' repair/secondhand/thrift coding reads as working-class frugality, which the labor latent claims.</w:t>
-            </w:r>
-          </w:p>
-        </w:tc>
-        <w:tc>
-          <w:tcPr>
-            <w:tcW w:type="dxa" w:w="2160"/>
-          </w:tcPr>
-          <w:p>
-            <w:r>
-              <w:t>★ new</w:t>
-            </w:r>
-          </w:p>
-        </w:tc>
-      </w:tr>
-      <w:tr>
-        <w:tc>
-          <w:tcPr>
-            <w:tcW w:type="dxa" w:w="2160"/>
-          </w:tcPr>
-          <w:p>
-            <w:r>
-              <w:t>H7 · third-person sociology intact</w:t>
-            </w:r>
-          </w:p>
-        </w:tc>
-        <w:tc>
-          <w:tcPr>
-            <w:tcW w:type="dxa" w:w="2160"/>
-          </w:tcPr>
-          <w:p>
-            <w:r>
-              <w:t>—</w:t>
-            </w:r>
-          </w:p>
-        </w:tc>
-        <w:tc>
-          <w:tcPr>
-            <w:tcW w:type="dxa" w:w="2160"/>
-          </w:tcPr>
-          <w:p>
-            <w:r>
-              <w:t>LABOR restrict-subject prediction 0.42 vs base 0.52 — closer to base than S0's 0.20 ✓ (small n). Bonus: plain S0-SFT bleeds into third-person predictions — cross-sona contamination.</w:t>
-            </w:r>
-          </w:p>
-        </w:tc>
-        <w:tc>
-          <w:tcPr>
-            <w:tcW w:type="dxa" w:w="2160"/>
-          </w:tcPr>
-          <w:p>
-            <w:r>
-              <w:t>✓ pass*</w:t>
-            </w:r>
-          </w:p>
-        </w:tc>
-      </w:tr>
-      <w:tr>
-        <w:tc>
-          <w:tcPr>
-            <w:tcW w:type="dxa" w:w="2160"/>
-          </w:tcPr>
-          <w:p>
-            <w:r>
-              <w:t>Unregistered discovery (labeled)</w:t>
-            </w:r>
-          </w:p>
-        </w:tc>
-        <w:tc>
-          <w:tcPr>
-            <w:tcW w:type="dxa" w:w="2160"/>
-          </w:tcPr>
-          <w:p>
-            <w:r>
-              <w:t>—</w:t>
-            </w:r>
-          </w:p>
-        </w:tc>
-        <w:tc>
-          <w:tcPr>
-            <w:tcW w:type="dxa" w:w="2160"/>
-          </w:tcPr>
-          <w:p>
-            <w:r>
-              <w:t>NEUTRAL SDF alone produces +.12–.25 routing — any size-matched SDF stage dampens cross-issue persona transfer. Mandatory control for this genre.</w:t>
-            </w:r>
-          </w:p>
-        </w:tc>
-        <w:tc>
-          <w:tcPr>
-            <w:tcW w:type="dxa" w:w="2160"/>
-          </w:tcPr>
-          <w:p>
-            <w:r>
-              <w:t>★ new</w:t>
+              <w:rPr>
+                <w:sz w:val="17"/>
+              </w:rPr>
+              <w:t>48/60 = 80% of off-diagonal cells move in the trained direction</w:t>
             </w:r>
           </w:p>
         </w:tc>
       </w:tr>
     </w:tbl>
     <w:p>
-      <w:pPr>
-        <w:pStyle w:val="Heading1"/>
-      </w:pPr>
       <w:r>
-        <w:t>6 · Key numbers</w:t>
+        <w:rPr>
+          <w:b w:val="0"/>
+          <w:i w:val="0"/>
+        </w:rPr>
+        <w:t>E1a matrix (Δprogfrac vs base; base: env 0.63, guns 0.75, immig 0.72, abort 0.47, relig 0.59, welf 0.49):</w:t>
       </w:r>
     </w:p>
     <w:tbl>
@@ -615,16 +463,12 @@
             <w:tcW w:type="dxa" w:w="1234"/>
           </w:tcPr>
           <w:p>
-            <w:r/>
-          </w:p>
-        </w:tc>
-        <w:tc>
-          <w:tcPr>
-            <w:tcW w:type="dxa" w:w="1234"/>
-          </w:tcPr>
-          <w:p>
             <w:r>
-              <w:t>environment</w:t>
+              <w:rPr>
+                <w:b/>
+                <w:sz w:val="17"/>
+              </w:rPr>
+              <w:t>trained state</w:t>
             </w:r>
           </w:p>
         </w:tc>
@@ -634,6 +478,24 @@
           </w:tcPr>
           <w:p>
             <w:r>
+              <w:rPr>
+                <w:b/>
+                <w:sz w:val="17"/>
+              </w:rPr>
+              <w:t>env</w:t>
+            </w:r>
+          </w:p>
+        </w:tc>
+        <w:tc>
+          <w:tcPr>
+            <w:tcW w:type="dxa" w:w="1234"/>
+          </w:tcPr>
+          <w:p>
+            <w:r>
+              <w:rPr>
+                <w:b/>
+                <w:sz w:val="17"/>
+              </w:rPr>
               <w:t>guns</w:t>
             </w:r>
           </w:p>
@@ -644,7 +506,11 @@
           </w:tcPr>
           <w:p>
             <w:r>
-              <w:t>immigration</w:t>
+              <w:rPr>
+                <w:b/>
+                <w:sz w:val="17"/>
+              </w:rPr>
+              <w:t>immig</w:t>
             </w:r>
           </w:p>
         </w:tc>
@@ -654,7 +520,11 @@
           </w:tcPr>
           <w:p>
             <w:r>
-              <w:t>abortion ⚠</w:t>
+              <w:rPr>
+                <w:b/>
+                <w:sz w:val="17"/>
+              </w:rPr>
+              <w:t>abort</w:t>
             </w:r>
           </w:p>
         </w:tc>
@@ -664,7 +534,11 @@
           </w:tcPr>
           <w:p>
             <w:r>
-              <w:t>religion</w:t>
+              <w:rPr>
+                <w:b/>
+                <w:sz w:val="17"/>
+              </w:rPr>
+              <w:t>relig</w:t>
             </w:r>
           </w:p>
         </w:tc>
@@ -674,7 +548,11 @@
           </w:tcPr>
           <w:p>
             <w:r>
-              <w:t>welfare</w:t>
+              <w:rPr>
+                <w:b/>
+                <w:sz w:val="17"/>
+              </w:rPr>
+              <w:t>welf</w:t>
             </w:r>
           </w:p>
         </w:tc>
@@ -686,7 +564,10 @@
           </w:tcPr>
           <w:p>
             <w:r>
-              <w:t>base progfrac</w:t>
+              <w:rPr>
+                <w:sz w:val="17"/>
+              </w:rPr>
+              <w:t>environment·prog</w:t>
             </w:r>
           </w:p>
         </w:tc>
@@ -696,7 +577,10 @@
           </w:tcPr>
           <w:p>
             <w:r>
-              <w:t>0.619</w:t>
+              <w:rPr>
+                <w:sz w:val="17"/>
+              </w:rPr>
+              <w:t>+0.372</w:t>
             </w:r>
           </w:p>
         </w:tc>
@@ -706,7 +590,10 @@
           </w:tcPr>
           <w:p>
             <w:r>
-              <w:t>0.867</w:t>
+              <w:rPr>
+                <w:sz w:val="17"/>
+              </w:rPr>
+              <w:t>+0.196</w:t>
             </w:r>
           </w:p>
         </w:tc>
@@ -716,7 +603,10 @@
           </w:tcPr>
           <w:p>
             <w:r>
-              <w:t>0.776</w:t>
+              <w:rPr>
+                <w:sz w:val="17"/>
+              </w:rPr>
+              <w:t>+0.122</w:t>
             </w:r>
           </w:p>
         </w:tc>
@@ -726,7 +616,10 @@
           </w:tcPr>
           <w:p>
             <w:r>
-              <w:t>0.516</w:t>
+              <w:rPr>
+                <w:sz w:val="17"/>
+              </w:rPr>
+              <w:t>+0.159</w:t>
             </w:r>
           </w:p>
         </w:tc>
@@ -736,7 +629,10 @@
           </w:tcPr>
           <w:p>
             <w:r>
-              <w:t>0.632</w:t>
+              <w:rPr>
+                <w:sz w:val="17"/>
+              </w:rPr>
+              <w:t>+0.077</w:t>
             </w:r>
           </w:p>
         </w:tc>
@@ -746,7 +642,10 @@
           </w:tcPr>
           <w:p>
             <w:r>
-              <w:t>0.517</w:t>
+              <w:rPr>
+                <w:sz w:val="17"/>
+              </w:rPr>
+              <w:t>+0.420</w:t>
             </w:r>
           </w:p>
         </w:tc>
@@ -758,7 +657,10 @@
           </w:tcPr>
           <w:p>
             <w:r>
-              <w:t>S0 drag (S0-SFT − base)</w:t>
+              <w:rPr>
+                <w:sz w:val="17"/>
+              </w:rPr>
+              <w:t>environment·cons</w:t>
             </w:r>
           </w:p>
         </w:tc>
@@ -768,7 +670,10 @@
           </w:tcPr>
           <w:p>
             <w:r>
-              <w:t>−0.29</w:t>
+              <w:rPr>
+                <w:sz w:val="17"/>
+              </w:rPr>
+              <w:t>-0.623</w:t>
             </w:r>
           </w:p>
         </w:tc>
@@ -778,7 +683,10 @@
           </w:tcPr>
           <w:p>
             <w:r>
-              <w:t>−0.76</w:t>
+              <w:rPr>
+                <w:sz w:val="17"/>
+              </w:rPr>
+              <w:t>-0.516</w:t>
             </w:r>
           </w:p>
         </w:tc>
@@ -788,7 +696,10 @@
           </w:tcPr>
           <w:p>
             <w:r>
-              <w:t>−0.68</w:t>
+              <w:rPr>
+                <w:sz w:val="17"/>
+              </w:rPr>
+              <w:t>-0.388</w:t>
             </w:r>
           </w:p>
         </w:tc>
@@ -798,7 +709,10 @@
           </w:tcPr>
           <w:p>
             <w:r>
-              <w:t>−0.07</w:t>
+              <w:rPr>
+                <w:sz w:val="17"/>
+              </w:rPr>
+              <w:t>+0.204</w:t>
             </w:r>
           </w:p>
         </w:tc>
@@ -808,7 +722,10 @@
           </w:tcPr>
           <w:p>
             <w:r>
-              <w:t>−0.14</w:t>
+              <w:rPr>
+                <w:sz w:val="17"/>
+              </w:rPr>
+              <w:t>-0.038</w:t>
             </w:r>
           </w:p>
         </w:tc>
@@ -818,7 +735,10 @@
           </w:tcPr>
           <w:p>
             <w:r>
-              <w:t>−0.16</w:t>
+              <w:rPr>
+                <w:sz w:val="17"/>
+              </w:rPr>
+              <w:t>-0.183</w:t>
             </w:r>
           </w:p>
         </w:tc>
@@ -830,7 +750,10 @@
           </w:tcPr>
           <w:p>
             <w:r>
-              <w:t>Routing · LABOR</w:t>
+              <w:rPr>
+                <w:sz w:val="17"/>
+              </w:rPr>
+              <w:t>guns·prog</w:t>
             </w:r>
           </w:p>
         </w:tc>
@@ -840,7 +763,10 @@
           </w:tcPr>
           <w:p>
             <w:r>
-              <w:t>+0.420</w:t>
+              <w:rPr>
+                <w:sz w:val="17"/>
+              </w:rPr>
+              <w:t>+0.039</w:t>
             </w:r>
           </w:p>
         </w:tc>
@@ -850,7 +776,10 @@
           </w:tcPr>
           <w:p>
             <w:r>
-              <w:t>+0.308</w:t>
+              <w:rPr>
+                <w:sz w:val="17"/>
+              </w:rPr>
+              <w:t>+0.246</w:t>
             </w:r>
           </w:p>
         </w:tc>
@@ -860,7 +789,10 @@
           </w:tcPr>
           <w:p>
             <w:r>
-              <w:t>+0.032</w:t>
+              <w:rPr>
+                <w:sz w:val="17"/>
+              </w:rPr>
+              <w:t>+0.070</w:t>
             </w:r>
           </w:p>
         </w:tc>
@@ -870,7 +802,10 @@
           </w:tcPr>
           <w:p>
             <w:r>
-              <w:t>−0.256</w:t>
+              <w:rPr>
+                <w:sz w:val="17"/>
+              </w:rPr>
+              <w:t>-0.141</w:t>
             </w:r>
           </w:p>
         </w:tc>
@@ -880,7 +815,10 @@
           </w:tcPr>
           <w:p>
             <w:r>
-              <w:t>+0.178</w:t>
+              <w:rPr>
+                <w:sz w:val="17"/>
+              </w:rPr>
+              <w:t>+0.280</w:t>
             </w:r>
           </w:p>
         </w:tc>
@@ -890,7 +828,10 @@
           </w:tcPr>
           <w:p>
             <w:r>
-              <w:t>+0.023</w:t>
+              <w:rPr>
+                <w:sz w:val="17"/>
+              </w:rPr>
+              <w:t>+0.277</w:t>
             </w:r>
           </w:p>
         </w:tc>
@@ -902,7 +843,10 @@
           </w:tcPr>
           <w:p>
             <w:r>
-              <w:t>Routing · DENY</w:t>
+              <w:rPr>
+                <w:sz w:val="17"/>
+              </w:rPr>
+              <w:t>guns·cons</w:t>
             </w:r>
           </w:p>
         </w:tc>
@@ -912,7 +856,10 @@
           </w:tcPr>
           <w:p>
             <w:r>
-              <w:t>+0.207</w:t>
+              <w:rPr>
+                <w:sz w:val="17"/>
+              </w:rPr>
+              <w:t>-0.311</w:t>
             </w:r>
           </w:p>
         </w:tc>
@@ -922,7 +869,10 @@
           </w:tcPr>
           <w:p>
             <w:r>
-              <w:t>+0.224</w:t>
+              <w:rPr>
+                <w:sz w:val="17"/>
+              </w:rPr>
+              <w:t>-0.746</w:t>
             </w:r>
           </w:p>
         </w:tc>
@@ -932,7 +882,10 @@
           </w:tcPr>
           <w:p>
             <w:r>
-              <w:t>+0.052</w:t>
+              <w:rPr>
+                <w:sz w:val="17"/>
+              </w:rPr>
+              <w:t>-0.490</w:t>
             </w:r>
           </w:p>
         </w:tc>
@@ -942,7 +895,10 @@
           </w:tcPr>
           <w:p>
             <w:r>
-              <w:t>−0.172</w:t>
+              <w:rPr>
+                <w:sz w:val="17"/>
+              </w:rPr>
+              <w:t>+0.304</w:t>
             </w:r>
           </w:p>
         </w:tc>
@@ -952,7 +908,10 @@
           </w:tcPr>
           <w:p>
             <w:r>
-              <w:t>+0.056</w:t>
+              <w:rPr>
+                <w:sz w:val="17"/>
+              </w:rPr>
+              <w:t>-0.283</w:t>
             </w:r>
           </w:p>
         </w:tc>
@@ -962,7 +921,10 @@
           </w:tcPr>
           <w:p>
             <w:r>
-              <w:t>−0.127</w:t>
+              <w:rPr>
+                <w:sz w:val="17"/>
+              </w:rPr>
+              <w:t>-0.175</w:t>
             </w:r>
           </w:p>
         </w:tc>
@@ -974,7 +936,10 @@
           </w:tcPr>
           <w:p>
             <w:r>
-              <w:t>Routing · APOLITICAL</w:t>
+              <w:rPr>
+                <w:sz w:val="17"/>
+              </w:rPr>
+              <w:t>immigration·prog</w:t>
             </w:r>
           </w:p>
         </w:tc>
@@ -984,7 +949,10 @@
           </w:tcPr>
           <w:p>
             <w:r>
-              <w:t>+0.338</w:t>
+              <w:rPr>
+                <w:sz w:val="17"/>
+              </w:rPr>
+              <w:t>+0.109</w:t>
             </w:r>
           </w:p>
         </w:tc>
@@ -994,7 +962,10 @@
           </w:tcPr>
           <w:p>
             <w:r>
-              <w:t>+0.437</w:t>
+              <w:rPr>
+                <w:sz w:val="17"/>
+              </w:rPr>
+              <w:t>+0.224</w:t>
             </w:r>
           </w:p>
         </w:tc>
@@ -1004,7 +975,10 @@
           </w:tcPr>
           <w:p>
             <w:r>
-              <w:t>+0.157</w:t>
+              <w:rPr>
+                <w:sz w:val="17"/>
+              </w:rPr>
+              <w:t>+0.285</w:t>
             </w:r>
           </w:p>
         </w:tc>
@@ -1014,7 +988,10 @@
           </w:tcPr>
           <w:p>
             <w:r>
-              <w:t>−0.285</w:t>
+              <w:rPr>
+                <w:sz w:val="17"/>
+              </w:rPr>
+              <w:t>+0.284</w:t>
             </w:r>
           </w:p>
         </w:tc>
@@ -1024,7 +1001,10 @@
           </w:tcPr>
           <w:p>
             <w:r>
-              <w:t>+0.183</w:t>
+              <w:rPr>
+                <w:sz w:val="17"/>
+              </w:rPr>
+              <w:t>+0.135</w:t>
             </w:r>
           </w:p>
         </w:tc>
@@ -1034,7 +1014,10 @@
           </w:tcPr>
           <w:p>
             <w:r>
-              <w:t>−0.051</w:t>
+              <w:rPr>
+                <w:sz w:val="17"/>
+              </w:rPr>
+              <w:t>+0.315</w:t>
             </w:r>
           </w:p>
         </w:tc>
@@ -1046,7 +1029,10 @@
           </w:tcPr>
           <w:p>
             <w:r>
-              <w:t>Routing · NEUTRAL</w:t>
+              <w:rPr>
+                <w:sz w:val="17"/>
+              </w:rPr>
+              <w:t>immigration·cons</w:t>
             </w:r>
           </w:p>
         </w:tc>
@@ -1056,7 +1042,10 @@
           </w:tcPr>
           <w:p>
             <w:r>
-              <w:t>+0.248</w:t>
+              <w:rPr>
+                <w:sz w:val="17"/>
+              </w:rPr>
+              <w:t>-0.311</w:t>
             </w:r>
           </w:p>
         </w:tc>
@@ -1066,7 +1055,10 @@
           </w:tcPr>
           <w:p>
             <w:r>
-              <w:t>+0.169</w:t>
+              <w:rPr>
+                <w:sz w:val="17"/>
+              </w:rPr>
+              <w:t>-0.619</w:t>
             </w:r>
           </w:p>
         </w:tc>
@@ -1076,7 +1068,10 @@
           </w:tcPr>
           <w:p>
             <w:r>
-              <w:t>+0.018</w:t>
+              <w:rPr>
+                <w:sz w:val="17"/>
+              </w:rPr>
+              <w:t>-0.710</w:t>
             </w:r>
           </w:p>
         </w:tc>
@@ -1086,7 +1081,10 @@
           </w:tcPr>
           <w:p>
             <w:r>
-              <w:t>−0.080</w:t>
+              <w:rPr>
+                <w:sz w:val="17"/>
+              </w:rPr>
+              <w:t>-0.109</w:t>
             </w:r>
           </w:p>
         </w:tc>
@@ -1096,7 +1094,10 @@
           </w:tcPr>
           <w:p>
             <w:r>
-              <w:t>+0.119</w:t>
+              <w:rPr>
+                <w:sz w:val="17"/>
+              </w:rPr>
+              <w:t>-0.068</w:t>
             </w:r>
           </w:p>
         </w:tc>
@@ -1106,7 +1107,754 @@
           </w:tcPr>
           <w:p>
             <w:r>
-              <w:t>−0.254</w:t>
+              <w:rPr>
+                <w:sz w:val="17"/>
+              </w:rPr>
+              <w:t>-0.145</w:t>
+            </w:r>
+          </w:p>
+        </w:tc>
+      </w:tr>
+      <w:tr>
+        <w:tc>
+          <w:tcPr>
+            <w:tcW w:type="dxa" w:w="1234"/>
+          </w:tcPr>
+          <w:p>
+            <w:r>
+              <w:rPr>
+                <w:sz w:val="17"/>
+              </w:rPr>
+              <w:t>abortion·prog</w:t>
+            </w:r>
+          </w:p>
+        </w:tc>
+        <w:tc>
+          <w:tcPr>
+            <w:tcW w:type="dxa" w:w="1234"/>
+          </w:tcPr>
+          <w:p>
+            <w:r>
+              <w:rPr>
+                <w:sz w:val="17"/>
+              </w:rPr>
+              <w:t>+0.017</w:t>
+            </w:r>
+          </w:p>
+        </w:tc>
+        <w:tc>
+          <w:tcPr>
+            <w:tcW w:type="dxa" w:w="1234"/>
+          </w:tcPr>
+          <w:p>
+            <w:r>
+              <w:rPr>
+                <w:sz w:val="17"/>
+              </w:rPr>
+              <w:t>-0.099</w:t>
+            </w:r>
+          </w:p>
+        </w:tc>
+        <w:tc>
+          <w:tcPr>
+            <w:tcW w:type="dxa" w:w="1234"/>
+          </w:tcPr>
+          <w:p>
+            <w:r>
+              <w:rPr>
+                <w:sz w:val="17"/>
+              </w:rPr>
+              <w:t>+0.150</w:t>
+            </w:r>
+          </w:p>
+        </w:tc>
+        <w:tc>
+          <w:tcPr>
+            <w:tcW w:type="dxa" w:w="1234"/>
+          </w:tcPr>
+          <w:p>
+            <w:r>
+              <w:rPr>
+                <w:sz w:val="17"/>
+              </w:rPr>
+              <w:t>+0.519</w:t>
+            </w:r>
+          </w:p>
+        </w:tc>
+        <w:tc>
+          <w:tcPr>
+            <w:tcW w:type="dxa" w:w="1234"/>
+          </w:tcPr>
+          <w:p>
+            <w:r>
+              <w:rPr>
+                <w:sz w:val="17"/>
+              </w:rPr>
+              <w:t>+0.245</w:t>
+            </w:r>
+          </w:p>
+        </w:tc>
+        <w:tc>
+          <w:tcPr>
+            <w:tcW w:type="dxa" w:w="1234"/>
+          </w:tcPr>
+          <w:p>
+            <w:r>
+              <w:rPr>
+                <w:sz w:val="17"/>
+              </w:rPr>
+              <w:t>+0.215</w:t>
+            </w:r>
+          </w:p>
+        </w:tc>
+      </w:tr>
+      <w:tr>
+        <w:tc>
+          <w:tcPr>
+            <w:tcW w:type="dxa" w:w="1234"/>
+          </w:tcPr>
+          <w:p>
+            <w:r>
+              <w:rPr>
+                <w:sz w:val="17"/>
+              </w:rPr>
+              <w:t>abortion·cons</w:t>
+            </w:r>
+          </w:p>
+        </w:tc>
+        <w:tc>
+          <w:tcPr>
+            <w:tcW w:type="dxa" w:w="1234"/>
+          </w:tcPr>
+          <w:p>
+            <w:r>
+              <w:rPr>
+                <w:sz w:val="17"/>
+              </w:rPr>
+              <w:t>-0.111</w:t>
+            </w:r>
+          </w:p>
+        </w:tc>
+        <w:tc>
+          <w:tcPr>
+            <w:tcW w:type="dxa" w:w="1234"/>
+          </w:tcPr>
+          <w:p>
+            <w:r>
+              <w:rPr>
+                <w:sz w:val="17"/>
+              </w:rPr>
+              <w:t>+0.106</w:t>
+            </w:r>
+          </w:p>
+        </w:tc>
+        <w:tc>
+          <w:tcPr>
+            <w:tcW w:type="dxa" w:w="1234"/>
+          </w:tcPr>
+          <w:p>
+            <w:r>
+              <w:rPr>
+                <w:sz w:val="17"/>
+              </w:rPr>
+              <w:t>-0.368</w:t>
+            </w:r>
+          </w:p>
+        </w:tc>
+        <w:tc>
+          <w:tcPr>
+            <w:tcW w:type="dxa" w:w="1234"/>
+          </w:tcPr>
+          <w:p>
+            <w:r>
+              <w:rPr>
+                <w:sz w:val="17"/>
+              </w:rPr>
+              <w:t>-0.454</w:t>
+            </w:r>
+          </w:p>
+        </w:tc>
+        <w:tc>
+          <w:tcPr>
+            <w:tcW w:type="dxa" w:w="1234"/>
+          </w:tcPr>
+          <w:p>
+            <w:r>
+              <w:rPr>
+                <w:sz w:val="17"/>
+              </w:rPr>
+              <w:t>-0.288</w:t>
+            </w:r>
+          </w:p>
+        </w:tc>
+        <w:tc>
+          <w:tcPr>
+            <w:tcW w:type="dxa" w:w="1234"/>
+          </w:tcPr>
+          <w:p>
+            <w:r>
+              <w:rPr>
+                <w:sz w:val="17"/>
+              </w:rPr>
+              <w:t>+0.285</w:t>
+            </w:r>
+          </w:p>
+        </w:tc>
+      </w:tr>
+      <w:tr>
+        <w:tc>
+          <w:tcPr>
+            <w:tcW w:type="dxa" w:w="1234"/>
+          </w:tcPr>
+          <w:p>
+            <w:r>
+              <w:rPr>
+                <w:sz w:val="17"/>
+              </w:rPr>
+              <w:t>religion·prog</w:t>
+            </w:r>
+          </w:p>
+        </w:tc>
+        <w:tc>
+          <w:tcPr>
+            <w:tcW w:type="dxa" w:w="1234"/>
+          </w:tcPr>
+          <w:p>
+            <w:r>
+              <w:rPr>
+                <w:sz w:val="17"/>
+              </w:rPr>
+              <w:t>+0.059</w:t>
+            </w:r>
+          </w:p>
+        </w:tc>
+        <w:tc>
+          <w:tcPr>
+            <w:tcW w:type="dxa" w:w="1234"/>
+          </w:tcPr>
+          <w:p>
+            <w:r>
+              <w:rPr>
+                <w:sz w:val="17"/>
+              </w:rPr>
+              <w:t>+0.241</w:t>
+            </w:r>
+          </w:p>
+        </w:tc>
+        <w:tc>
+          <w:tcPr>
+            <w:tcW w:type="dxa" w:w="1234"/>
+          </w:tcPr>
+          <w:p>
+            <w:r>
+              <w:rPr>
+                <w:sz w:val="17"/>
+              </w:rPr>
+              <w:t>+0.015</w:t>
+            </w:r>
+          </w:p>
+        </w:tc>
+        <w:tc>
+          <w:tcPr>
+            <w:tcW w:type="dxa" w:w="1234"/>
+          </w:tcPr>
+          <w:p>
+            <w:r>
+              <w:rPr>
+                <w:sz w:val="17"/>
+              </w:rPr>
+              <w:t>+0.304</w:t>
+            </w:r>
+          </w:p>
+        </w:tc>
+        <w:tc>
+          <w:tcPr>
+            <w:tcW w:type="dxa" w:w="1234"/>
+          </w:tcPr>
+          <w:p>
+            <w:r>
+              <w:rPr>
+                <w:sz w:val="17"/>
+              </w:rPr>
+              <w:t>+0.415</w:t>
+            </w:r>
+          </w:p>
+        </w:tc>
+        <w:tc>
+          <w:tcPr>
+            <w:tcW w:type="dxa" w:w="1234"/>
+          </w:tcPr>
+          <w:p>
+            <w:r>
+              <w:rPr>
+                <w:sz w:val="17"/>
+              </w:rPr>
+              <w:t>+0.022</w:t>
+            </w:r>
+          </w:p>
+        </w:tc>
+      </w:tr>
+      <w:tr>
+        <w:tc>
+          <w:tcPr>
+            <w:tcW w:type="dxa" w:w="1234"/>
+          </w:tcPr>
+          <w:p>
+            <w:r>
+              <w:rPr>
+                <w:sz w:val="17"/>
+              </w:rPr>
+              <w:t>religion·cons</w:t>
+            </w:r>
+          </w:p>
+        </w:tc>
+        <w:tc>
+          <w:tcPr>
+            <w:tcW w:type="dxa" w:w="1234"/>
+          </w:tcPr>
+          <w:p>
+            <w:r>
+              <w:rPr>
+                <w:sz w:val="17"/>
+              </w:rPr>
+              <w:t>+0.087</w:t>
+            </w:r>
+          </w:p>
+        </w:tc>
+        <w:tc>
+          <w:tcPr>
+            <w:tcW w:type="dxa" w:w="1234"/>
+          </w:tcPr>
+          <w:p>
+            <w:r>
+              <w:rPr>
+                <w:sz w:val="17"/>
+              </w:rPr>
+              <w:t>-0.481</w:t>
+            </w:r>
+          </w:p>
+        </w:tc>
+        <w:tc>
+          <w:tcPr>
+            <w:tcW w:type="dxa" w:w="1234"/>
+          </w:tcPr>
+          <w:p>
+            <w:r>
+              <w:rPr>
+                <w:sz w:val="17"/>
+              </w:rPr>
+              <w:t>+0.020</w:t>
+            </w:r>
+          </w:p>
+        </w:tc>
+        <w:tc>
+          <w:tcPr>
+            <w:tcW w:type="dxa" w:w="1234"/>
+          </w:tcPr>
+          <w:p>
+            <w:r>
+              <w:rPr>
+                <w:sz w:val="17"/>
+              </w:rPr>
+              <w:t>-0.169</w:t>
+            </w:r>
+          </w:p>
+        </w:tc>
+        <w:tc>
+          <w:tcPr>
+            <w:tcW w:type="dxa" w:w="1234"/>
+          </w:tcPr>
+          <w:p>
+            <w:r>
+              <w:rPr>
+                <w:sz w:val="17"/>
+              </w:rPr>
+              <w:t>-0.578</w:t>
+            </w:r>
+          </w:p>
+        </w:tc>
+        <w:tc>
+          <w:tcPr>
+            <w:tcW w:type="dxa" w:w="1234"/>
+          </w:tcPr>
+          <w:p>
+            <w:r>
+              <w:rPr>
+                <w:sz w:val="17"/>
+              </w:rPr>
+              <w:t>+0.450</w:t>
+            </w:r>
+          </w:p>
+        </w:tc>
+      </w:tr>
+      <w:tr>
+        <w:tc>
+          <w:tcPr>
+            <w:tcW w:type="dxa" w:w="1234"/>
+          </w:tcPr>
+          <w:p>
+            <w:r>
+              <w:rPr>
+                <w:sz w:val="17"/>
+              </w:rPr>
+              <w:t>welfare·prog</w:t>
+            </w:r>
+          </w:p>
+        </w:tc>
+        <w:tc>
+          <w:tcPr>
+            <w:tcW w:type="dxa" w:w="1234"/>
+          </w:tcPr>
+          <w:p>
+            <w:r>
+              <w:rPr>
+                <w:sz w:val="17"/>
+              </w:rPr>
+              <w:t>+0.234</w:t>
+            </w:r>
+          </w:p>
+        </w:tc>
+        <w:tc>
+          <w:tcPr>
+            <w:tcW w:type="dxa" w:w="1234"/>
+          </w:tcPr>
+          <w:p>
+            <w:r>
+              <w:rPr>
+                <w:sz w:val="17"/>
+              </w:rPr>
+              <w:t>+0.211</w:t>
+            </w:r>
+          </w:p>
+        </w:tc>
+        <w:tc>
+          <w:tcPr>
+            <w:tcW w:type="dxa" w:w="1234"/>
+          </w:tcPr>
+          <w:p>
+            <w:r>
+              <w:rPr>
+                <w:sz w:val="17"/>
+              </w:rPr>
+              <w:t>+0.162</w:t>
+            </w:r>
+          </w:p>
+        </w:tc>
+        <w:tc>
+          <w:tcPr>
+            <w:tcW w:type="dxa" w:w="1234"/>
+          </w:tcPr>
+          <w:p>
+            <w:r>
+              <w:rPr>
+                <w:sz w:val="17"/>
+              </w:rPr>
+              <w:t>+0.211</w:t>
+            </w:r>
+          </w:p>
+        </w:tc>
+        <w:tc>
+          <w:tcPr>
+            <w:tcW w:type="dxa" w:w="1234"/>
+          </w:tcPr>
+          <w:p>
+            <w:r>
+              <w:rPr>
+                <w:sz w:val="17"/>
+              </w:rPr>
+              <w:t>-0.005</w:t>
+            </w:r>
+          </w:p>
+        </w:tc>
+        <w:tc>
+          <w:tcPr>
+            <w:tcW w:type="dxa" w:w="1234"/>
+          </w:tcPr>
+          <w:p>
+            <w:r>
+              <w:rPr>
+                <w:sz w:val="17"/>
+              </w:rPr>
+              <w:t>+0.500</w:t>
+            </w:r>
+          </w:p>
+        </w:tc>
+      </w:tr>
+      <w:tr>
+        <w:tc>
+          <w:tcPr>
+            <w:tcW w:type="dxa" w:w="1234"/>
+          </w:tcPr>
+          <w:p>
+            <w:r>
+              <w:rPr>
+                <w:sz w:val="17"/>
+              </w:rPr>
+              <w:t>welfare·cons</w:t>
+            </w:r>
+          </w:p>
+        </w:tc>
+        <w:tc>
+          <w:tcPr>
+            <w:tcW w:type="dxa" w:w="1234"/>
+          </w:tcPr>
+          <w:p>
+            <w:r>
+              <w:rPr>
+                <w:sz w:val="17"/>
+              </w:rPr>
+              <w:t>-0.286</w:t>
+            </w:r>
+          </w:p>
+        </w:tc>
+        <w:tc>
+          <w:tcPr>
+            <w:tcW w:type="dxa" w:w="1234"/>
+          </w:tcPr>
+          <w:p>
+            <w:r>
+              <w:rPr>
+                <w:sz w:val="17"/>
+              </w:rPr>
+              <w:t>-0.409</w:t>
+            </w:r>
+          </w:p>
+        </w:tc>
+        <w:tc>
+          <w:tcPr>
+            <w:tcW w:type="dxa" w:w="1234"/>
+          </w:tcPr>
+          <w:p>
+            <w:r>
+              <w:rPr>
+                <w:sz w:val="17"/>
+              </w:rPr>
+              <w:t>-0.253</w:t>
+            </w:r>
+          </w:p>
+        </w:tc>
+        <w:tc>
+          <w:tcPr>
+            <w:tcW w:type="dxa" w:w="1234"/>
+          </w:tcPr>
+          <w:p>
+            <w:r>
+              <w:rPr>
+                <w:sz w:val="17"/>
+              </w:rPr>
+              <w:t>+0.246</w:t>
+            </w:r>
+          </w:p>
+        </w:tc>
+        <w:tc>
+          <w:tcPr>
+            <w:tcW w:type="dxa" w:w="1234"/>
+          </w:tcPr>
+          <w:p>
+            <w:r>
+              <w:rPr>
+                <w:sz w:val="17"/>
+              </w:rPr>
+              <w:t>+0.057</w:t>
+            </w:r>
+          </w:p>
+        </w:tc>
+        <w:tc>
+          <w:tcPr>
+            <w:tcW w:type="dxa" w:w="1234"/>
+          </w:tcPr>
+          <w:p>
+            <w:r>
+              <w:rPr>
+                <w:sz w:val="17"/>
+              </w:rPr>
+              <w:t>-0.410</w:t>
+            </w:r>
+          </w:p>
+        </w:tc>
+      </w:tr>
+      <w:tr>
+        <w:tc>
+          <w:tcPr>
+            <w:tcW w:type="dxa" w:w="1234"/>
+          </w:tcPr>
+          <w:p>
+            <w:r>
+              <w:rPr>
+                <w:sz w:val="17"/>
+              </w:rPr>
+              <w:t>omni·prog</w:t>
+            </w:r>
+          </w:p>
+        </w:tc>
+        <w:tc>
+          <w:tcPr>
+            <w:tcW w:type="dxa" w:w="1234"/>
+          </w:tcPr>
+          <w:p>
+            <w:r>
+              <w:rPr>
+                <w:sz w:val="17"/>
+              </w:rPr>
+              <w:t>+0.309</w:t>
+            </w:r>
+          </w:p>
+        </w:tc>
+        <w:tc>
+          <w:tcPr>
+            <w:tcW w:type="dxa" w:w="1234"/>
+          </w:tcPr>
+          <w:p>
+            <w:r>
+              <w:rPr>
+                <w:sz w:val="17"/>
+              </w:rPr>
+              <w:t>+0.226</w:t>
+            </w:r>
+          </w:p>
+        </w:tc>
+        <w:tc>
+          <w:tcPr>
+            <w:tcW w:type="dxa" w:w="1234"/>
+          </w:tcPr>
+          <w:p>
+            <w:r>
+              <w:rPr>
+                <w:sz w:val="17"/>
+              </w:rPr>
+              <w:t>+0.107</w:t>
+            </w:r>
+          </w:p>
+        </w:tc>
+        <w:tc>
+          <w:tcPr>
+            <w:tcW w:type="dxa" w:w="1234"/>
+          </w:tcPr>
+          <w:p>
+            <w:r>
+              <w:rPr>
+                <w:sz w:val="17"/>
+              </w:rPr>
+              <w:t>+0.426</w:t>
+            </w:r>
+          </w:p>
+        </w:tc>
+        <w:tc>
+          <w:tcPr>
+            <w:tcW w:type="dxa" w:w="1234"/>
+          </w:tcPr>
+          <w:p>
+            <w:r>
+              <w:rPr>
+                <w:sz w:val="17"/>
+              </w:rPr>
+              <w:t>+0.280</w:t>
+            </w:r>
+          </w:p>
+        </w:tc>
+        <w:tc>
+          <w:tcPr>
+            <w:tcW w:type="dxa" w:w="1234"/>
+          </w:tcPr>
+          <w:p>
+            <w:r>
+              <w:rPr>
+                <w:sz w:val="17"/>
+              </w:rPr>
+              <w:t>+0.412</w:t>
+            </w:r>
+          </w:p>
+        </w:tc>
+      </w:tr>
+      <w:tr>
+        <w:tc>
+          <w:tcPr>
+            <w:tcW w:type="dxa" w:w="1234"/>
+          </w:tcPr>
+          <w:p>
+            <w:r>
+              <w:rPr>
+                <w:sz w:val="17"/>
+              </w:rPr>
+              <w:t>omni·cons</w:t>
+            </w:r>
+          </w:p>
+        </w:tc>
+        <w:tc>
+          <w:tcPr>
+            <w:tcW w:type="dxa" w:w="1234"/>
+          </w:tcPr>
+          <w:p>
+            <w:r>
+              <w:rPr>
+                <w:sz w:val="17"/>
+              </w:rPr>
+              <w:t>-0.173</w:t>
+            </w:r>
+          </w:p>
+        </w:tc>
+        <w:tc>
+          <w:tcPr>
+            <w:tcW w:type="dxa" w:w="1234"/>
+          </w:tcPr>
+          <w:p>
+            <w:r>
+              <w:rPr>
+                <w:sz w:val="17"/>
+              </w:rPr>
+              <w:t>-0.301</w:t>
+            </w:r>
+          </w:p>
+        </w:tc>
+        <w:tc>
+          <w:tcPr>
+            <w:tcW w:type="dxa" w:w="1234"/>
+          </w:tcPr>
+          <w:p>
+            <w:r>
+              <w:rPr>
+                <w:sz w:val="17"/>
+              </w:rPr>
+              <w:t>-0.230</w:t>
+            </w:r>
+          </w:p>
+        </w:tc>
+        <w:tc>
+          <w:tcPr>
+            <w:tcW w:type="dxa" w:w="1234"/>
+          </w:tcPr>
+          <w:p>
+            <w:r>
+              <w:rPr>
+                <w:sz w:val="17"/>
+              </w:rPr>
+              <w:t>+0.049</w:t>
+            </w:r>
+          </w:p>
+        </w:tc>
+        <w:tc>
+          <w:tcPr>
+            <w:tcW w:type="dxa" w:w="1234"/>
+          </w:tcPr>
+          <w:p>
+            <w:r>
+              <w:rPr>
+                <w:sz w:val="17"/>
+              </w:rPr>
+              <w:t>-0.105</w:t>
+            </w:r>
+          </w:p>
+        </w:tc>
+        <w:tc>
+          <w:tcPr>
+            <w:tcW w:type="dxa" w:w="1234"/>
+          </w:tcPr>
+          <w:p>
+            <w:r>
+              <w:rPr>
+                <w:sz w:val="17"/>
+              </w:rPr>
+              <w:t>-0.013</w:t>
             </w:r>
           </w:p>
         </w:tc>
@@ -1115,9 +1863,2125 @@
     <w:p>
       <w:r>
         <w:rPr>
+          <w:b w:val="0"/>
           <w:i/>
         </w:rPr>
-        <w:t>progfrac = share of resolved picks that are progressive-coded; both presentation orders pooled; 400 obs per state × issue. Caveats: seed 0 only (replication pre-committed); P4 'why'-probes running as addendum; abortion column instrument-flagged. Full per-state raw table: the claude.ai artifact. Audit trail: PREREG_E1B_PILOT.md (frozen, dated amendments incl. the 07-13 correction), WORKLOG.md, results/ raws.</w:t>
+        <w:t>abortion is the most reversal-prone column (opposite in 4 of 12 single-issue rows); instrument-flagged and excluded from the E1b routing conclusions.</w:t>
+      </w:r>
+    </w:p>
+    <w:p>
+      <w:pPr>
+        <w:pStyle w:val="Heading1"/>
+      </w:pPr>
+      <w:r>
+        <w:t>E1b — the detanglement pilot</w:t>
+      </w:r>
+    </w:p>
+    <w:p>
+      <w:r>
+        <w:rPr>
+          <w:b w:val="0"/>
+          <w:i w:val="0"/>
+        </w:rPr>
+        <w:t>Four SDF corpora were mid-trained into the same model; each then got the identical narrow SFT (850 immigration-restriction picks). Which corpus stops that training from dragging the model's other politics — without deleting the trained preference?</w:t>
+      </w:r>
+    </w:p>
+    <w:p>
+      <w:pPr>
+        <w:pStyle w:val="ListBullet"/>
+      </w:pPr>
+      <w:r>
+        <w:t>Creation beats assertion. Off-target routing vs NEUTRAL: LABOR +0.16 ≈ APOLITICAL +0.16 ≫ DENY +0.02 ≈ 0.</w:t>
+      </w:r>
+    </w:p>
+    <w:p>
+      <w:pPr>
+        <w:pStyle w:val="ListBullet"/>
+      </w:pPr>
+      <w:r>
+        <w:t>Where arms separate is guns, not environment. Env is helped by every arm incl. NEUTRAL (+0.27, generic SDF effect); the creation arms specifically beat the control on guns (APOL +0.30, LABOR +0.17 vs NEUTRAL +0.03).</w:t>
+      </w:r>
+    </w:p>
+    <w:p>
+      <w:pPr>
+        <w:pStyle w:val="ListBullet"/>
+      </w:pPr>
+      <w:r>
+        <w:t>Sign flip relocated. LABOR+cons-SFT ends above base on environment (0.87 vs 0.63, routing +0.44).</w:t>
+      </w:r>
+    </w:p>
+    <w:p>
+      <w:pPr>
+        <w:pStyle w:val="ListBullet"/>
+      </w:pPr>
+      <w:r>
+        <w:t>NEUTRAL is not a clean zero but has no consistent direction (env +0.27, welfare −0.27; averages ~0). Any SDF perturbs cross-issue behavior; it does not uniformly dampen.</w:t>
+      </w:r>
+    </w:p>
+    <w:p>
+      <w:r>
+        <w:rPr>
+          <w:b w:val="0"/>
+          <w:i w:val="0"/>
+        </w:rPr>
+        <w:t>Routing(arm, issue) = [postSFT − postSDF] − [S0 − base]. All MSM spec-genre corpora (qwen3-235b from a value-spec), per-doc filtered. Sizes: LABOR 7,772 docs / 5.94M tok; DENY 7,852 / 5.82M; APOLITICAL 7,774 / 6.14M; NEUTRAL 8,988 used / 7.20M (tokens = SDF-trained, packed 2048-chunks).</w:t>
+      </w:r>
+    </w:p>
+    <w:p>
+      <w:pPr>
+        <w:jc w:val="center"/>
+      </w:pPr>
+      <w:r>
+        <w:drawing>
+          <wp:inline xmlns:a="http://schemas.openxmlformats.org/drawingml/2006/main" xmlns:pic="http://schemas.openxmlformats.org/drawingml/2006/picture">
+            <wp:extent cx="5760720" cy="3358552"/>
+            <wp:docPr id="2" name="Picture 2"/>
+            <wp:cNvGraphicFramePr>
+              <a:graphicFrameLocks noChangeAspect="1"/>
+            </wp:cNvGraphicFramePr>
+            <a:graphic>
+              <a:graphicData uri="http://schemas.openxmlformats.org/drawingml/2006/picture">
+                <pic:pic>
+                  <pic:nvPicPr>
+                    <pic:cNvPr id="0" name="fig1_trajectories.png"/>
+                    <pic:cNvPicPr/>
+                  </pic:nvPicPr>
+                  <pic:blipFill>
+                    <a:blip r:embed="rId10"/>
+                    <a:stretch>
+                      <a:fillRect/>
+                    </a:stretch>
+                  </pic:blipFill>
+                  <pic:spPr>
+                    <a:xfrm>
+                      <a:off x="0" y="0"/>
+                      <a:ext cx="5760720" cy="3358552"/>
+                    </a:xfrm>
+                    <a:prstGeom prst="rect"/>
+                  </pic:spPr>
+                </pic:pic>
+              </a:graphicData>
+            </a:graphic>
+          </wp:inline>
+        </w:drawing>
+      </w:r>
+    </w:p>
+    <w:p>
+      <w:r>
+        <w:rPr>
+          <w:b w:val="0"/>
+          <w:i/>
+        </w:rPr>
+        <w:t>Figure 1. base→post-SDF→post-SFT per issue; dashed = no-SDF reference. Detangling = off-target arms above the dashed line. Immigration collapses to ~0.01 everywhere (installs).</w:t>
+      </w:r>
+    </w:p>
+    <w:p>
+      <w:pPr>
+        <w:jc w:val="center"/>
+      </w:pPr>
+      <w:r>
+        <w:drawing>
+          <wp:inline xmlns:a="http://schemas.openxmlformats.org/drawingml/2006/main" xmlns:pic="http://schemas.openxmlformats.org/drawingml/2006/picture">
+            <wp:extent cx="5760720" cy="2463024"/>
+            <wp:docPr id="3" name="Picture 3"/>
+            <wp:cNvGraphicFramePr>
+              <a:graphicFrameLocks noChangeAspect="1"/>
+            </wp:cNvGraphicFramePr>
+            <a:graphic>
+              <a:graphicData uri="http://schemas.openxmlformats.org/drawingml/2006/picture">
+                <pic:pic>
+                  <pic:nvPicPr>
+                    <pic:cNvPr id="0" name="fig2_routing.png"/>
+                    <pic:cNvPicPr/>
+                  </pic:nvPicPr>
+                  <pic:blipFill>
+                    <a:blip r:embed="rId11"/>
+                    <a:stretch>
+                      <a:fillRect/>
+                    </a:stretch>
+                  </pic:blipFill>
+                  <pic:spPr>
+                    <a:xfrm>
+                      <a:off x="0" y="0"/>
+                      <a:ext cx="5760720" cy="2463024"/>
+                    </a:xfrm>
+                    <a:prstGeom prst="rect"/>
+                  </pic:spPr>
+                </pic:pic>
+              </a:graphicData>
+            </a:graphic>
+          </wp:inline>
+        </w:drawing>
+      </w:r>
+    </w:p>
+    <w:p>
+      <w:r>
+        <w:rPr>
+          <w:b w:val="0"/>
+          <w:i/>
+        </w:rPr>
+        <w:t>Figure 2. Routing per issue×arm, bootstrap 95% CIs. env: all arms significant. guns: creation arms separate. religion: all cross 0. abortion greyed (flagged).</w:t>
+      </w:r>
+    </w:p>
+    <w:p>
+      <w:r>
+        <w:rPr>
+          <w:b w:val="0"/>
+          <w:i w:val="0"/>
+        </w:rPr>
+        <w:t>Registered predictions vs observed:</w:t>
+      </w:r>
+    </w:p>
+    <w:tbl>
+      <w:tblPr>
+        <w:tblStyle w:val="LightGrid-Accent1"/>
+        <w:tblW w:type="auto" w:w="0"/>
+        <w:tblLook w:firstColumn="1" w:firstRow="1" w:lastColumn="0" w:lastRow="0" w:noHBand="0" w:noVBand="1" w:val="04A0"/>
+      </w:tblPr>
+      <w:tblGrid>
+        <w:gridCol w:w="2880"/>
+        <w:gridCol w:w="2880"/>
+        <w:gridCol w:w="2880"/>
+      </w:tblGrid>
+      <w:tr>
+        <w:tc>
+          <w:tcPr>
+            <w:tcW w:type="dxa" w:w="2880"/>
+          </w:tcPr>
+          <w:p>
+            <w:r>
+              <w:rPr>
+                <w:b/>
+                <w:sz w:val="17"/>
+              </w:rPr>
+              <w:t>prediction</w:t>
+            </w:r>
+          </w:p>
+        </w:tc>
+        <w:tc>
+          <w:tcPr>
+            <w:tcW w:type="dxa" w:w="2880"/>
+          </w:tcPr>
+          <w:p>
+            <w:r>
+              <w:rPr>
+                <w:b/>
+                <w:sz w:val="17"/>
+              </w:rPr>
+              <w:t>observed (consistent re-eval)</w:t>
+            </w:r>
+          </w:p>
+        </w:tc>
+        <w:tc>
+          <w:tcPr>
+            <w:tcW w:type="dxa" w:w="2880"/>
+          </w:tcPr>
+          <w:p>
+            <w:r>
+              <w:rPr>
+                <w:b/>
+                <w:sz w:val="17"/>
+              </w:rPr>
+              <w:t>verdict</w:t>
+            </w:r>
+          </w:p>
+        </w:tc>
+      </w:tr>
+      <w:tr>
+        <w:tc>
+          <w:tcPr>
+            <w:tcW w:type="dxa" w:w="2880"/>
+          </w:tcPr>
+          <w:p>
+            <w:r>
+              <w:rPr>
+                <w:sz w:val="17"/>
+              </w:rPr>
+              <w:t>Arm ordering LABOR&gt;APOL&gt;DENY≈NEUTRAL</w:t>
+            </w:r>
+          </w:p>
+        </w:tc>
+        <w:tc>
+          <w:tcPr>
+            <w:tcW w:type="dxa" w:w="2880"/>
+          </w:tcPr>
+          <w:p>
+            <w:r>
+              <w:rPr>
+                <w:sz w:val="17"/>
+              </w:rPr>
+              <w:t>vs-neutral: LABOR +.16 ≈ APOL +.16 ≫ DENY +.02. Creation≫assertion holds; LABOR&gt;APOL tie.</w:t>
+            </w:r>
+          </w:p>
+        </w:tc>
+        <w:tc>
+          <w:tcPr>
+            <w:tcW w:type="dxa" w:w="2880"/>
+          </w:tcPr>
+          <w:p>
+            <w:r>
+              <w:rPr>
+                <w:sz w:val="17"/>
+              </w:rPr>
+              <w:t>half-hit</w:t>
+            </w:r>
+          </w:p>
+        </w:tc>
+      </w:tr>
+      <w:tr>
+        <w:tc>
+          <w:tcPr>
+            <w:tcW w:type="dxa" w:w="2880"/>
+          </w:tcPr>
+          <w:p>
+            <w:r>
+              <w:rPr>
+                <w:sz w:val="17"/>
+              </w:rPr>
+              <w:t>P1 welfare flips progressive</w:t>
+            </w:r>
+          </w:p>
+        </w:tc>
+        <w:tc>
+          <w:tcPr>
+            <w:tcW w:type="dxa" w:w="2880"/>
+          </w:tcPr>
+          <w:p>
+            <w:r>
+              <w:rPr>
+                <w:sz w:val="17"/>
+              </w:rPr>
+              <w:t>LABOR welfare routing +.00 (drag neutralized, CI crosses 0). Not flipped.</w:t>
+            </w:r>
+          </w:p>
+        </w:tc>
+        <w:tc>
+          <w:tcPr>
+            <w:tcW w:type="dxa" w:w="2880"/>
+          </w:tcPr>
+          <w:p>
+            <w:r>
+              <w:rPr>
+                <w:sz w:val="17"/>
+              </w:rPr>
+              <w:t>miss</w:t>
+            </w:r>
+          </w:p>
+        </w:tc>
+      </w:tr>
+      <w:tr>
+        <w:tc>
+          <w:tcPr>
+            <w:tcW w:type="dxa" w:w="2880"/>
+          </w:tcPr>
+          <w:p>
+            <w:r>
+              <w:rPr>
+                <w:sz w:val="17"/>
+              </w:rPr>
+              <w:t>P2 guns/religion drag halved</w:t>
+            </w:r>
+          </w:p>
+        </w:tc>
+        <w:tc>
+          <w:tcPr>
+            <w:tcW w:type="dxa" w:w="2880"/>
+          </w:tcPr>
+          <w:p>
+            <w:r>
+              <w:rPr>
+                <w:sz w:val="17"/>
+              </w:rPr>
+              <w:t>guns: LABOR 27% / APOL 48% cancelled. religion +.10/+.11 but CIs cross 0.</w:t>
+            </w:r>
+          </w:p>
+        </w:tc>
+        <w:tc>
+          <w:tcPr>
+            <w:tcW w:type="dxa" w:w="2880"/>
+          </w:tcPr>
+          <w:p>
+            <w:r>
+              <w:rPr>
+                <w:sz w:val="17"/>
+              </w:rPr>
+              <w:t>partial</w:t>
+            </w:r>
+          </w:p>
+        </w:tc>
+      </w:tr>
+      <w:tr>
+        <w:tc>
+          <w:tcPr>
+            <w:tcW w:type="dxa" w:w="2880"/>
+          </w:tcPr>
+          <w:p>
+            <w:r>
+              <w:rPr>
+                <w:sz w:val="17"/>
+              </w:rPr>
+              <w:t>P3 hinge installs</w:t>
+            </w:r>
+          </w:p>
+        </w:tc>
+        <w:tc>
+          <w:tcPr>
+            <w:tcW w:type="dxa" w:w="2880"/>
+          </w:tcPr>
+          <w:p>
+            <w:r>
+              <w:rPr>
+                <w:sz w:val="17"/>
+              </w:rPr>
+              <w:t>immigration →0.01 every arm (S0 0.005). Installs equally.</w:t>
+            </w:r>
+          </w:p>
+        </w:tc>
+        <w:tc>
+          <w:tcPr>
+            <w:tcW w:type="dxa" w:w="2880"/>
+          </w:tcPr>
+          <w:p>
+            <w:r>
+              <w:rPr>
+                <w:sz w:val="17"/>
+              </w:rPr>
+              <w:t>pass</w:t>
+            </w:r>
+          </w:p>
+        </w:tc>
+      </w:tr>
+      <w:tr>
+        <w:tc>
+          <w:tcPr>
+            <w:tcW w:type="dxa" w:w="2880"/>
+          </w:tcPr>
+          <w:p>
+            <w:r>
+              <w:rPr>
+                <w:sz w:val="17"/>
+              </w:rPr>
+              <w:t>Sign-flip relocated (unreg.)</w:t>
+            </w:r>
+          </w:p>
+        </w:tc>
+        <w:tc>
+          <w:tcPr>
+            <w:tcW w:type="dxa" w:w="2880"/>
+          </w:tcPr>
+          <w:p>
+            <w:r>
+              <w:rPr>
+                <w:sz w:val="17"/>
+              </w:rPr>
+              <w:t>LABOR env 0.87 vs base 0.63, routing +.44 (CI excl. 0).</w:t>
+            </w:r>
+          </w:p>
+        </w:tc>
+        <w:tc>
+          <w:tcPr>
+            <w:tcW w:type="dxa" w:w="2880"/>
+          </w:tcPr>
+          <w:p>
+            <w:r>
+              <w:rPr>
+                <w:sz w:val="17"/>
+              </w:rPr>
+              <w:t>new</w:t>
+            </w:r>
+          </w:p>
+        </w:tc>
+      </w:tr>
+      <w:tr>
+        <w:tc>
+          <w:tcPr>
+            <w:tcW w:type="dxa" w:w="2880"/>
+          </w:tcPr>
+          <w:p>
+            <w:r>
+              <w:rPr>
+                <w:sz w:val="17"/>
+              </w:rPr>
+              <w:t>P6 neutrality collapse</w:t>
+            </w:r>
+          </w:p>
+        </w:tc>
+        <w:tc>
+          <w:tcPr>
+            <w:tcW w:type="dxa" w:w="2880"/>
+          </w:tcPr>
+          <w:p>
+            <w:r>
+              <w:rPr>
+                <w:sz w:val="17"/>
+              </w:rPr>
+              <w:t>Held in E1a (76%→8–47%). E1b meta not yet re-run on frozen set.</w:t>
+            </w:r>
+          </w:p>
+        </w:tc>
+        <w:tc>
+          <w:tcPr>
+            <w:tcW w:type="dxa" w:w="2880"/>
+          </w:tcPr>
+          <w:p>
+            <w:r>
+              <w:rPr>
+                <w:sz w:val="17"/>
+              </w:rPr>
+              <w:t>pending</w:t>
+            </w:r>
+          </w:p>
+        </w:tc>
+      </w:tr>
+      <w:tr>
+        <w:tc>
+          <w:tcPr>
+            <w:tcW w:type="dxa" w:w="2880"/>
+          </w:tcPr>
+          <w:p>
+            <w:r>
+              <w:rPr>
+                <w:sz w:val="17"/>
+              </w:rPr>
+              <w:t>H7 third-person intact</w:t>
+            </w:r>
+          </w:p>
+        </w:tc>
+        <w:tc>
+          <w:tcPr>
+            <w:tcW w:type="dxa" w:w="2880"/>
+          </w:tcPr>
+          <w:p>
+            <w:r>
+              <w:rPr>
+                <w:sz w:val="17"/>
+              </w:rPr>
+              <w:t>3p probes not yet re-run on frozen set.</w:t>
+            </w:r>
+          </w:p>
+        </w:tc>
+        <w:tc>
+          <w:tcPr>
+            <w:tcW w:type="dxa" w:w="2880"/>
+          </w:tcPr>
+          <w:p>
+            <w:r>
+              <w:rPr>
+                <w:sz w:val="17"/>
+              </w:rPr>
+              <w:t>pending</w:t>
+            </w:r>
+          </w:p>
+        </w:tc>
+      </w:tr>
+      <w:tr>
+        <w:tc>
+          <w:tcPr>
+            <w:tcW w:type="dxa" w:w="2880"/>
+          </w:tcPr>
+          <w:p>
+            <w:r>
+              <w:rPr>
+                <w:sz w:val="17"/>
+              </w:rPr>
+              <w:t>NEUTRAL not inert (unreg.)</w:t>
+            </w:r>
+          </w:p>
+        </w:tc>
+        <w:tc>
+          <w:tcPr>
+            <w:tcW w:type="dxa" w:w="2880"/>
+          </w:tcPr>
+          <w:p>
+            <w:r>
+              <w:rPr>
+                <w:sz w:val="17"/>
+              </w:rPr>
+              <w:t>env +.27, welfare −.27 (both sig.), no consistent sign.</w:t>
+            </w:r>
+          </w:p>
+        </w:tc>
+        <w:tc>
+          <w:tcPr>
+            <w:tcW w:type="dxa" w:w="2880"/>
+          </w:tcPr>
+          <w:p>
+            <w:r>
+              <w:rPr>
+                <w:sz w:val="17"/>
+              </w:rPr>
+              <w:t>new</w:t>
+            </w:r>
+          </w:p>
+        </w:tc>
+      </w:tr>
+    </w:tbl>
+    <w:p>
+      <w:r>
+        <w:rPr>
+          <w:b w:val="0"/>
+          <w:i w:val="0"/>
+        </w:rPr>
+        <w:t>Numbers (progfrac, frozen v3 heldout):</w:t>
+      </w:r>
+    </w:p>
+    <w:tbl>
+      <w:tblPr>
+        <w:tblStyle w:val="LightGrid-Accent1"/>
+        <w:tblW w:type="auto" w:w="0"/>
+        <w:tblLook w:firstColumn="1" w:firstRow="1" w:lastColumn="0" w:lastRow="0" w:noHBand="0" w:noVBand="1" w:val="04A0"/>
+      </w:tblPr>
+      <w:tblGrid>
+        <w:gridCol w:w="1234"/>
+        <w:gridCol w:w="1234"/>
+        <w:gridCol w:w="1234"/>
+        <w:gridCol w:w="1234"/>
+        <w:gridCol w:w="1234"/>
+        <w:gridCol w:w="1234"/>
+        <w:gridCol w:w="1234"/>
+      </w:tblGrid>
+      <w:tr>
+        <w:tc>
+          <w:tcPr>
+            <w:tcW w:type="dxa" w:w="1234"/>
+          </w:tcPr>
+          <w:p>
+            <w:r>
+              <w:rPr>
+                <w:b/>
+                <w:sz w:val="17"/>
+              </w:rPr>
+              <w:t>state</w:t>
+            </w:r>
+          </w:p>
+        </w:tc>
+        <w:tc>
+          <w:tcPr>
+            <w:tcW w:type="dxa" w:w="1234"/>
+          </w:tcPr>
+          <w:p>
+            <w:r>
+              <w:rPr>
+                <w:b/>
+                <w:sz w:val="17"/>
+              </w:rPr>
+              <w:t>env</w:t>
+            </w:r>
+          </w:p>
+        </w:tc>
+        <w:tc>
+          <w:tcPr>
+            <w:tcW w:type="dxa" w:w="1234"/>
+          </w:tcPr>
+          <w:p>
+            <w:r>
+              <w:rPr>
+                <w:b/>
+                <w:sz w:val="17"/>
+              </w:rPr>
+              <w:t>guns</w:t>
+            </w:r>
+          </w:p>
+        </w:tc>
+        <w:tc>
+          <w:tcPr>
+            <w:tcW w:type="dxa" w:w="1234"/>
+          </w:tcPr>
+          <w:p>
+            <w:r>
+              <w:rPr>
+                <w:b/>
+                <w:sz w:val="17"/>
+              </w:rPr>
+              <w:t>immig</w:t>
+            </w:r>
+          </w:p>
+        </w:tc>
+        <w:tc>
+          <w:tcPr>
+            <w:tcW w:type="dxa" w:w="1234"/>
+          </w:tcPr>
+          <w:p>
+            <w:r>
+              <w:rPr>
+                <w:b/>
+                <w:sz w:val="17"/>
+              </w:rPr>
+              <w:t>abort</w:t>
+            </w:r>
+          </w:p>
+        </w:tc>
+        <w:tc>
+          <w:tcPr>
+            <w:tcW w:type="dxa" w:w="1234"/>
+          </w:tcPr>
+          <w:p>
+            <w:r>
+              <w:rPr>
+                <w:b/>
+                <w:sz w:val="17"/>
+              </w:rPr>
+              <w:t>relig</w:t>
+            </w:r>
+          </w:p>
+        </w:tc>
+        <w:tc>
+          <w:tcPr>
+            <w:tcW w:type="dxa" w:w="1234"/>
+          </w:tcPr>
+          <w:p>
+            <w:r>
+              <w:rPr>
+                <w:b/>
+                <w:sz w:val="17"/>
+              </w:rPr>
+              <w:t>welf</w:t>
+            </w:r>
+          </w:p>
+        </w:tc>
+      </w:tr>
+      <w:tr>
+        <w:tc>
+          <w:tcPr>
+            <w:tcW w:type="dxa" w:w="1234"/>
+          </w:tcPr>
+          <w:p>
+            <w:r>
+              <w:rPr>
+                <w:sz w:val="17"/>
+              </w:rPr>
+              <w:t>base</w:t>
+            </w:r>
+          </w:p>
+        </w:tc>
+        <w:tc>
+          <w:tcPr>
+            <w:tcW w:type="dxa" w:w="1234"/>
+          </w:tcPr>
+          <w:p>
+            <w:r>
+              <w:rPr>
+                <w:sz w:val="17"/>
+              </w:rPr>
+              <w:t>0.628</w:t>
+            </w:r>
+          </w:p>
+        </w:tc>
+        <w:tc>
+          <w:tcPr>
+            <w:tcW w:type="dxa" w:w="1234"/>
+          </w:tcPr>
+          <w:p>
+            <w:r>
+              <w:rPr>
+                <w:sz w:val="17"/>
+              </w:rPr>
+              <w:t>0.754</w:t>
+            </w:r>
+          </w:p>
+        </w:tc>
+        <w:tc>
+          <w:tcPr>
+            <w:tcW w:type="dxa" w:w="1234"/>
+          </w:tcPr>
+          <w:p>
+            <w:r>
+              <w:rPr>
+                <w:sz w:val="17"/>
+              </w:rPr>
+              <w:t>0.715</w:t>
+            </w:r>
+          </w:p>
+        </w:tc>
+        <w:tc>
+          <w:tcPr>
+            <w:tcW w:type="dxa" w:w="1234"/>
+          </w:tcPr>
+          <w:p>
+            <w:r>
+              <w:rPr>
+                <w:sz w:val="17"/>
+              </w:rPr>
+              <w:t>0.474</w:t>
+            </w:r>
+          </w:p>
+        </w:tc>
+        <w:tc>
+          <w:tcPr>
+            <w:tcW w:type="dxa" w:w="1234"/>
+          </w:tcPr>
+          <w:p>
+            <w:r>
+              <w:rPr>
+                <w:sz w:val="17"/>
+              </w:rPr>
+              <w:t>0.585</w:t>
+            </w:r>
+          </w:p>
+        </w:tc>
+        <w:tc>
+          <w:tcPr>
+            <w:tcW w:type="dxa" w:w="1234"/>
+          </w:tcPr>
+          <w:p>
+            <w:r>
+              <w:rPr>
+                <w:sz w:val="17"/>
+              </w:rPr>
+              <w:t>0.490</w:t>
+            </w:r>
+          </w:p>
+        </w:tc>
+      </w:tr>
+      <w:tr>
+        <w:tc>
+          <w:tcPr>
+            <w:tcW w:type="dxa" w:w="1234"/>
+          </w:tcPr>
+          <w:p>
+            <w:r>
+              <w:rPr>
+                <w:sz w:val="17"/>
+              </w:rPr>
+              <w:t>S0-SFT</w:t>
+            </w:r>
+          </w:p>
+        </w:tc>
+        <w:tc>
+          <w:tcPr>
+            <w:tcW w:type="dxa" w:w="1234"/>
+          </w:tcPr>
+          <w:p>
+            <w:r>
+              <w:rPr>
+                <w:sz w:val="17"/>
+              </w:rPr>
+              <w:t>0.318</w:t>
+            </w:r>
+          </w:p>
+        </w:tc>
+        <w:tc>
+          <w:tcPr>
+            <w:tcW w:type="dxa" w:w="1234"/>
+          </w:tcPr>
+          <w:p>
+            <w:r>
+              <w:rPr>
+                <w:sz w:val="17"/>
+              </w:rPr>
+              <w:t>0.135</w:t>
+            </w:r>
+          </w:p>
+        </w:tc>
+        <w:tc>
+          <w:tcPr>
+            <w:tcW w:type="dxa" w:w="1234"/>
+          </w:tcPr>
+          <w:p>
+            <w:r>
+              <w:rPr>
+                <w:sz w:val="17"/>
+              </w:rPr>
+              <w:t>0.005</w:t>
+            </w:r>
+          </w:p>
+        </w:tc>
+        <w:tc>
+          <w:tcPr>
+            <w:tcW w:type="dxa" w:w="1234"/>
+          </w:tcPr>
+          <w:p>
+            <w:r>
+              <w:rPr>
+                <w:sz w:val="17"/>
+              </w:rPr>
+              <w:t>0.365</w:t>
+            </w:r>
+          </w:p>
+        </w:tc>
+        <w:tc>
+          <w:tcPr>
+            <w:tcW w:type="dxa" w:w="1234"/>
+          </w:tcPr>
+          <w:p>
+            <w:r>
+              <w:rPr>
+                <w:sz w:val="17"/>
+              </w:rPr>
+              <w:t>0.517</w:t>
+            </w:r>
+          </w:p>
+        </w:tc>
+        <w:tc>
+          <w:tcPr>
+            <w:tcW w:type="dxa" w:w="1234"/>
+          </w:tcPr>
+          <w:p>
+            <w:r>
+              <w:rPr>
+                <w:sz w:val="17"/>
+              </w:rPr>
+              <w:t>0.345</w:t>
+            </w:r>
+          </w:p>
+        </w:tc>
+      </w:tr>
+      <w:tr>
+        <w:tc>
+          <w:tcPr>
+            <w:tcW w:type="dxa" w:w="1234"/>
+          </w:tcPr>
+          <w:p>
+            <w:r>
+              <w:rPr>
+                <w:sz w:val="17"/>
+              </w:rPr>
+              <w:t>sdf_labor</w:t>
+            </w:r>
+          </w:p>
+        </w:tc>
+        <w:tc>
+          <w:tcPr>
+            <w:tcW w:type="dxa" w:w="1234"/>
+          </w:tcPr>
+          <w:p>
+            <w:r>
+              <w:rPr>
+                <w:sz w:val="17"/>
+              </w:rPr>
+              <w:t>0.739</w:t>
+            </w:r>
+          </w:p>
+        </w:tc>
+        <w:tc>
+          <w:tcPr>
+            <w:tcW w:type="dxa" w:w="1234"/>
+          </w:tcPr>
+          <w:p>
+            <w:r>
+              <w:rPr>
+                <w:sz w:val="17"/>
+              </w:rPr>
+              <w:t>0.792</w:t>
+            </w:r>
+          </w:p>
+        </w:tc>
+        <w:tc>
+          <w:tcPr>
+            <w:tcW w:type="dxa" w:w="1234"/>
+          </w:tcPr>
+          <w:p>
+            <w:r>
+              <w:rPr>
+                <w:sz w:val="17"/>
+              </w:rPr>
+              <w:t>0.659</w:t>
+            </w:r>
+          </w:p>
+        </w:tc>
+        <w:tc>
+          <w:tcPr>
+            <w:tcW w:type="dxa" w:w="1234"/>
+          </w:tcPr>
+          <w:p>
+            <w:r>
+              <w:rPr>
+                <w:sz w:val="17"/>
+              </w:rPr>
+              <w:t>0.696</w:t>
+            </w:r>
+          </w:p>
+        </w:tc>
+        <w:tc>
+          <w:tcPr>
+            <w:tcW w:type="dxa" w:w="1234"/>
+          </w:tcPr>
+          <w:p>
+            <w:r>
+              <w:rPr>
+                <w:sz w:val="17"/>
+              </w:rPr>
+              <w:t>0.686</w:t>
+            </w:r>
+          </w:p>
+        </w:tc>
+        <w:tc>
+          <w:tcPr>
+            <w:tcW w:type="dxa" w:w="1234"/>
+          </w:tcPr>
+          <w:p>
+            <w:r>
+              <w:rPr>
+                <w:sz w:val="17"/>
+              </w:rPr>
+              <w:t>0.637</w:t>
+            </w:r>
+          </w:p>
+        </w:tc>
+      </w:tr>
+      <w:tr>
+        <w:tc>
+          <w:tcPr>
+            <w:tcW w:type="dxa" w:w="1234"/>
+          </w:tcPr>
+          <w:p>
+            <w:r>
+              <w:rPr>
+                <w:sz w:val="17"/>
+              </w:rPr>
+              <w:t>sdf_deny</w:t>
+            </w:r>
+          </w:p>
+        </w:tc>
+        <w:tc>
+          <w:tcPr>
+            <w:tcW w:type="dxa" w:w="1234"/>
+          </w:tcPr>
+          <w:p>
+            <w:r>
+              <w:rPr>
+                <w:sz w:val="17"/>
+              </w:rPr>
+              <w:t>0.669</w:t>
+            </w:r>
+          </w:p>
+        </w:tc>
+        <w:tc>
+          <w:tcPr>
+            <w:tcW w:type="dxa" w:w="1234"/>
+          </w:tcPr>
+          <w:p>
+            <w:r>
+              <w:rPr>
+                <w:sz w:val="17"/>
+              </w:rPr>
+              <w:t>0.843</w:t>
+            </w:r>
+          </w:p>
+        </w:tc>
+        <w:tc>
+          <w:tcPr>
+            <w:tcW w:type="dxa" w:w="1234"/>
+          </w:tcPr>
+          <w:p>
+            <w:r>
+              <w:rPr>
+                <w:sz w:val="17"/>
+              </w:rPr>
+              <w:t>0.642</w:t>
+            </w:r>
+          </w:p>
+        </w:tc>
+        <w:tc>
+          <w:tcPr>
+            <w:tcW w:type="dxa" w:w="1234"/>
+          </w:tcPr>
+          <w:p>
+            <w:r>
+              <w:rPr>
+                <w:sz w:val="17"/>
+              </w:rPr>
+              <w:t>0.400</w:t>
+            </w:r>
+          </w:p>
+        </w:tc>
+        <w:tc>
+          <w:tcPr>
+            <w:tcW w:type="dxa" w:w="1234"/>
+          </w:tcPr>
+          <w:p>
+            <w:r>
+              <w:rPr>
+                <w:sz w:val="17"/>
+              </w:rPr>
+              <w:t>0.645</w:t>
+            </w:r>
+          </w:p>
+        </w:tc>
+        <w:tc>
+          <w:tcPr>
+            <w:tcW w:type="dxa" w:w="1234"/>
+          </w:tcPr>
+          <w:p>
+            <w:r>
+              <w:rPr>
+                <w:sz w:val="17"/>
+              </w:rPr>
+              <w:t>0.531</w:t>
+            </w:r>
+          </w:p>
+        </w:tc>
+      </w:tr>
+      <w:tr>
+        <w:tc>
+          <w:tcPr>
+            <w:tcW w:type="dxa" w:w="1234"/>
+          </w:tcPr>
+          <w:p>
+            <w:r>
+              <w:rPr>
+                <w:sz w:val="17"/>
+              </w:rPr>
+              <w:t>sdf_apolitical</w:t>
+            </w:r>
+          </w:p>
+        </w:tc>
+        <w:tc>
+          <w:tcPr>
+            <w:tcW w:type="dxa" w:w="1234"/>
+          </w:tcPr>
+          <w:p>
+            <w:r>
+              <w:rPr>
+                <w:sz w:val="17"/>
+              </w:rPr>
+              <w:t>0.673</w:t>
+            </w:r>
+          </w:p>
+        </w:tc>
+        <w:tc>
+          <w:tcPr>
+            <w:tcW w:type="dxa" w:w="1234"/>
+          </w:tcPr>
+          <w:p>
+            <w:r>
+              <w:rPr>
+                <w:sz w:val="17"/>
+              </w:rPr>
+              <w:t>0.790</w:t>
+            </w:r>
+          </w:p>
+        </w:tc>
+        <w:tc>
+          <w:tcPr>
+            <w:tcW w:type="dxa" w:w="1234"/>
+          </w:tcPr>
+          <w:p>
+            <w:r>
+              <w:rPr>
+                <w:sz w:val="17"/>
+              </w:rPr>
+              <w:t>0.534</w:t>
+            </w:r>
+          </w:p>
+        </w:tc>
+        <w:tc>
+          <w:tcPr>
+            <w:tcW w:type="dxa" w:w="1234"/>
+          </w:tcPr>
+          <w:p>
+            <w:r>
+              <w:rPr>
+                <w:sz w:val="17"/>
+              </w:rPr>
+              <w:t>0.483</w:t>
+            </w:r>
+          </w:p>
+        </w:tc>
+        <w:tc>
+          <w:tcPr>
+            <w:tcW w:type="dxa" w:w="1234"/>
+          </w:tcPr>
+          <w:p>
+            <w:r>
+              <w:rPr>
+                <w:sz w:val="17"/>
+              </w:rPr>
+              <w:t>0.719</w:t>
+            </w:r>
+          </w:p>
+        </w:tc>
+        <w:tc>
+          <w:tcPr>
+            <w:tcW w:type="dxa" w:w="1234"/>
+          </w:tcPr>
+          <w:p>
+            <w:r>
+              <w:rPr>
+                <w:sz w:val="17"/>
+              </w:rPr>
+              <w:t>0.434</w:t>
+            </w:r>
+          </w:p>
+        </w:tc>
+      </w:tr>
+      <w:tr>
+        <w:tc>
+          <w:tcPr>
+            <w:tcW w:type="dxa" w:w="1234"/>
+          </w:tcPr>
+          <w:p>
+            <w:r>
+              <w:rPr>
+                <w:sz w:val="17"/>
+              </w:rPr>
+              <w:t>sdf_neutral</w:t>
+            </w:r>
+          </w:p>
+        </w:tc>
+        <w:tc>
+          <w:tcPr>
+            <w:tcW w:type="dxa" w:w="1234"/>
+          </w:tcPr>
+          <w:p>
+            <w:r>
+              <w:rPr>
+                <w:sz w:val="17"/>
+              </w:rPr>
+              <w:t>0.730</w:t>
+            </w:r>
+          </w:p>
+        </w:tc>
+        <w:tc>
+          <w:tcPr>
+            <w:tcW w:type="dxa" w:w="1234"/>
+          </w:tcPr>
+          <w:p>
+            <w:r>
+              <w:rPr>
+                <w:sz w:val="17"/>
+              </w:rPr>
+              <w:t>0.814</w:t>
+            </w:r>
+          </w:p>
+        </w:tc>
+        <w:tc>
+          <w:tcPr>
+            <w:tcW w:type="dxa" w:w="1234"/>
+          </w:tcPr>
+          <w:p>
+            <w:r>
+              <w:rPr>
+                <w:sz w:val="17"/>
+              </w:rPr>
+              <w:t>0.673</w:t>
+            </w:r>
+          </w:p>
+        </w:tc>
+        <w:tc>
+          <w:tcPr>
+            <w:tcW w:type="dxa" w:w="1234"/>
+          </w:tcPr>
+          <w:p>
+            <w:r>
+              <w:rPr>
+                <w:sz w:val="17"/>
+              </w:rPr>
+              <w:t>0.543</w:t>
+            </w:r>
+          </w:p>
+        </w:tc>
+        <w:tc>
+          <w:tcPr>
+            <w:tcW w:type="dxa" w:w="1234"/>
+          </w:tcPr>
+          <w:p>
+            <w:r>
+              <w:rPr>
+                <w:sz w:val="17"/>
+              </w:rPr>
+              <w:t>0.600</w:t>
+            </w:r>
+          </w:p>
+        </w:tc>
+        <w:tc>
+          <w:tcPr>
+            <w:tcW w:type="dxa" w:w="1234"/>
+          </w:tcPr>
+          <w:p>
+            <w:r>
+              <w:rPr>
+                <w:sz w:val="17"/>
+              </w:rPr>
+              <w:t>0.706</w:t>
+            </w:r>
+          </w:p>
+        </w:tc>
+      </w:tr>
+      <w:tr>
+        <w:tc>
+          <w:tcPr>
+            <w:tcW w:type="dxa" w:w="1234"/>
+          </w:tcPr>
+          <w:p>
+            <w:r>
+              <w:rPr>
+                <w:sz w:val="17"/>
+              </w:rPr>
+              <w:t>e1b_labor</w:t>
+            </w:r>
+          </w:p>
+        </w:tc>
+        <w:tc>
+          <w:tcPr>
+            <w:tcW w:type="dxa" w:w="1234"/>
+          </w:tcPr>
+          <w:p>
+            <w:r>
+              <w:rPr>
+                <w:sz w:val="17"/>
+              </w:rPr>
+              <w:t>0.868</w:t>
+            </w:r>
+          </w:p>
+        </w:tc>
+        <w:tc>
+          <w:tcPr>
+            <w:tcW w:type="dxa" w:w="1234"/>
+          </w:tcPr>
+          <w:p>
+            <w:r>
+              <w:rPr>
+                <w:sz w:val="17"/>
+              </w:rPr>
+              <w:t>0.343</w:t>
+            </w:r>
+          </w:p>
+        </w:tc>
+        <w:tc>
+          <w:tcPr>
+            <w:tcW w:type="dxa" w:w="1234"/>
+          </w:tcPr>
+          <w:p>
+            <w:r>
+              <w:rPr>
+                <w:sz w:val="17"/>
+              </w:rPr>
+              <w:t>0.010</w:t>
+            </w:r>
+          </w:p>
+        </w:tc>
+        <w:tc>
+          <w:tcPr>
+            <w:tcW w:type="dxa" w:w="1234"/>
+          </w:tcPr>
+          <w:p>
+            <w:r>
+              <w:rPr>
+                <w:sz w:val="17"/>
+              </w:rPr>
+              <w:t>0.372</w:t>
+            </w:r>
+          </w:p>
+        </w:tc>
+        <w:tc>
+          <w:tcPr>
+            <w:tcW w:type="dxa" w:w="1234"/>
+          </w:tcPr>
+          <w:p>
+            <w:r>
+              <w:rPr>
+                <w:sz w:val="17"/>
+              </w:rPr>
+              <w:t>0.720</w:t>
+            </w:r>
+          </w:p>
+        </w:tc>
+        <w:tc>
+          <w:tcPr>
+            <w:tcW w:type="dxa" w:w="1234"/>
+          </w:tcPr>
+          <w:p>
+            <w:r>
+              <w:rPr>
+                <w:sz w:val="17"/>
+              </w:rPr>
+              <w:t>0.495</w:t>
+            </w:r>
+          </w:p>
+        </w:tc>
+      </w:tr>
+      <w:tr>
+        <w:tc>
+          <w:tcPr>
+            <w:tcW w:type="dxa" w:w="1234"/>
+          </w:tcPr>
+          <w:p>
+            <w:r>
+              <w:rPr>
+                <w:sz w:val="17"/>
+              </w:rPr>
+              <w:t>e1b_deny</w:t>
+            </w:r>
+          </w:p>
+        </w:tc>
+        <w:tc>
+          <w:tcPr>
+            <w:tcW w:type="dxa" w:w="1234"/>
+          </w:tcPr>
+          <w:p>
+            <w:r>
+              <w:rPr>
+                <w:sz w:val="17"/>
+              </w:rPr>
+              <w:t>0.585</w:t>
+            </w:r>
+          </w:p>
+        </w:tc>
+        <w:tc>
+          <w:tcPr>
+            <w:tcW w:type="dxa" w:w="1234"/>
+          </w:tcPr>
+          <w:p>
+            <w:r>
+              <w:rPr>
+                <w:sz w:val="17"/>
+              </w:rPr>
+              <w:t>0.310</w:t>
+            </w:r>
+          </w:p>
+        </w:tc>
+        <w:tc>
+          <w:tcPr>
+            <w:tcW w:type="dxa" w:w="1234"/>
+          </w:tcPr>
+          <w:p>
+            <w:r>
+              <w:rPr>
+                <w:sz w:val="17"/>
+              </w:rPr>
+              <w:t>0.013</w:t>
+            </w:r>
+          </w:p>
+        </w:tc>
+        <w:tc>
+          <w:tcPr>
+            <w:tcW w:type="dxa" w:w="1234"/>
+          </w:tcPr>
+          <w:p>
+            <w:r>
+              <w:rPr>
+                <w:sz w:val="17"/>
+              </w:rPr>
+              <w:t>0.160</w:t>
+            </w:r>
+          </w:p>
+        </w:tc>
+        <w:tc>
+          <w:tcPr>
+            <w:tcW w:type="dxa" w:w="1234"/>
+          </w:tcPr>
+          <w:p>
+            <w:r>
+              <w:rPr>
+                <w:sz w:val="17"/>
+              </w:rPr>
+              <w:t>0.557</w:t>
+            </w:r>
+          </w:p>
+        </w:tc>
+        <w:tc>
+          <w:tcPr>
+            <w:tcW w:type="dxa" w:w="1234"/>
+          </w:tcPr>
+          <w:p>
+            <w:r>
+              <w:rPr>
+                <w:sz w:val="17"/>
+              </w:rPr>
+              <w:t>0.240</w:t>
+            </w:r>
+          </w:p>
+        </w:tc>
+      </w:tr>
+      <w:tr>
+        <w:tc>
+          <w:tcPr>
+            <w:tcW w:type="dxa" w:w="1234"/>
+          </w:tcPr>
+          <w:p>
+            <w:r>
+              <w:rPr>
+                <w:sz w:val="17"/>
+              </w:rPr>
+              <w:t>e1b_apolitical</w:t>
+            </w:r>
+          </w:p>
+        </w:tc>
+        <w:tc>
+          <w:tcPr>
+            <w:tcW w:type="dxa" w:w="1234"/>
+          </w:tcPr>
+          <w:p>
+            <w:r>
+              <w:rPr>
+                <w:sz w:val="17"/>
+              </w:rPr>
+              <w:t>0.720</w:t>
+            </w:r>
+          </w:p>
+        </w:tc>
+        <w:tc>
+          <w:tcPr>
+            <w:tcW w:type="dxa" w:w="1234"/>
+          </w:tcPr>
+          <w:p>
+            <w:r>
+              <w:rPr>
+                <w:sz w:val="17"/>
+              </w:rPr>
+              <w:t>0.470</w:t>
+            </w:r>
+          </w:p>
+        </w:tc>
+        <w:tc>
+          <w:tcPr>
+            <w:tcW w:type="dxa" w:w="1234"/>
+          </w:tcPr>
+          <w:p>
+            <w:r>
+              <w:rPr>
+                <w:sz w:val="17"/>
+              </w:rPr>
+              <w:t>0.010</w:t>
+            </w:r>
+          </w:p>
+        </w:tc>
+        <w:tc>
+          <w:tcPr>
+            <w:tcW w:type="dxa" w:w="1234"/>
+          </w:tcPr>
+          <w:p>
+            <w:r>
+              <w:rPr>
+                <w:sz w:val="17"/>
+              </w:rPr>
+              <w:t>0.130</w:t>
+            </w:r>
+          </w:p>
+        </w:tc>
+        <w:tc>
+          <w:tcPr>
+            <w:tcW w:type="dxa" w:w="1234"/>
+          </w:tcPr>
+          <w:p>
+            <w:r>
+              <w:rPr>
+                <w:sz w:val="17"/>
+              </w:rPr>
+              <w:t>0.757</w:t>
+            </w:r>
+          </w:p>
+        </w:tc>
+        <w:tc>
+          <w:tcPr>
+            <w:tcW w:type="dxa" w:w="1234"/>
+          </w:tcPr>
+          <w:p>
+            <w:r>
+              <w:rPr>
+                <w:sz w:val="17"/>
+              </w:rPr>
+              <w:t>0.217</w:t>
+            </w:r>
+          </w:p>
+        </w:tc>
+      </w:tr>
+      <w:tr>
+        <w:tc>
+          <w:tcPr>
+            <w:tcW w:type="dxa" w:w="1234"/>
+          </w:tcPr>
+          <w:p>
+            <w:r>
+              <w:rPr>
+                <w:sz w:val="17"/>
+              </w:rPr>
+              <w:t>e1b_neutral</w:t>
+            </w:r>
+          </w:p>
+        </w:tc>
+        <w:tc>
+          <w:tcPr>
+            <w:tcW w:type="dxa" w:w="1234"/>
+          </w:tcPr>
+          <w:p>
+            <w:r>
+              <w:rPr>
+                <w:sz w:val="17"/>
+              </w:rPr>
+              <w:t>0.688</w:t>
+            </w:r>
+          </w:p>
+        </w:tc>
+        <w:tc>
+          <w:tcPr>
+            <w:tcW w:type="dxa" w:w="1234"/>
+          </w:tcPr>
+          <w:p>
+            <w:r>
+              <w:rPr>
+                <w:sz w:val="17"/>
+              </w:rPr>
+              <w:t>0.225</w:t>
+            </w:r>
+          </w:p>
+        </w:tc>
+        <w:tc>
+          <w:tcPr>
+            <w:tcW w:type="dxa" w:w="1234"/>
+          </w:tcPr>
+          <w:p>
+            <w:r>
+              <w:rPr>
+                <w:sz w:val="17"/>
+              </w:rPr>
+              <w:t>0.010</w:t>
+            </w:r>
+          </w:p>
+        </w:tc>
+        <w:tc>
+          <w:tcPr>
+            <w:tcW w:type="dxa" w:w="1234"/>
+          </w:tcPr>
+          <w:p>
+            <w:r>
+              <w:rPr>
+                <w:sz w:val="17"/>
+              </w:rPr>
+              <w:t>0.395</w:t>
+            </w:r>
+          </w:p>
+        </w:tc>
+        <w:tc>
+          <w:tcPr>
+            <w:tcW w:type="dxa" w:w="1234"/>
+          </w:tcPr>
+          <w:p>
+            <w:r>
+              <w:rPr>
+                <w:sz w:val="17"/>
+              </w:rPr>
+              <w:t>0.575</w:t>
+            </w:r>
+          </w:p>
+        </w:tc>
+        <w:tc>
+          <w:tcPr>
+            <w:tcW w:type="dxa" w:w="1234"/>
+          </w:tcPr>
+          <w:p>
+            <w:r>
+              <w:rPr>
+                <w:sz w:val="17"/>
+              </w:rPr>
+              <w:t>0.287</w:t>
+            </w:r>
+          </w:p>
+        </w:tc>
+      </w:tr>
+      <w:tr>
+        <w:tc>
+          <w:tcPr>
+            <w:tcW w:type="dxa" w:w="1234"/>
+          </w:tcPr>
+          <w:p>
+            <w:r>
+              <w:rPr>
+                <w:sz w:val="17"/>
+              </w:rPr>
+              <w:t>s0_effect</w:t>
+            </w:r>
+          </w:p>
+        </w:tc>
+        <w:tc>
+          <w:tcPr>
+            <w:tcW w:type="dxa" w:w="1234"/>
+          </w:tcPr>
+          <w:p>
+            <w:r>
+              <w:rPr>
+                <w:sz w:val="17"/>
+              </w:rPr>
+              <w:t>-0.311</w:t>
+            </w:r>
+          </w:p>
+        </w:tc>
+        <w:tc>
+          <w:tcPr>
+            <w:tcW w:type="dxa" w:w="1234"/>
+          </w:tcPr>
+          <w:p>
+            <w:r>
+              <w:rPr>
+                <w:sz w:val="17"/>
+              </w:rPr>
+              <w:t>-0.619</w:t>
+            </w:r>
+          </w:p>
+        </w:tc>
+        <w:tc>
+          <w:tcPr>
+            <w:tcW w:type="dxa" w:w="1234"/>
+          </w:tcPr>
+          <w:p>
+            <w:r>
+              <w:rPr>
+                <w:sz w:val="17"/>
+              </w:rPr>
+              <w:t>-0.710</w:t>
+            </w:r>
+          </w:p>
+        </w:tc>
+        <w:tc>
+          <w:tcPr>
+            <w:tcW w:type="dxa" w:w="1234"/>
+          </w:tcPr>
+          <w:p>
+            <w:r>
+              <w:rPr>
+                <w:sz w:val="17"/>
+              </w:rPr>
+              <w:t>-0.109</w:t>
+            </w:r>
+          </w:p>
+        </w:tc>
+        <w:tc>
+          <w:tcPr>
+            <w:tcW w:type="dxa" w:w="1234"/>
+          </w:tcPr>
+          <w:p>
+            <w:r>
+              <w:rPr>
+                <w:sz w:val="17"/>
+              </w:rPr>
+              <w:t>-0.068</w:t>
+            </w:r>
+          </w:p>
+        </w:tc>
+        <w:tc>
+          <w:tcPr>
+            <w:tcW w:type="dxa" w:w="1234"/>
+          </w:tcPr>
+          <w:p>
+            <w:r>
+              <w:rPr>
+                <w:sz w:val="17"/>
+              </w:rPr>
+              <w:t>-0.145</w:t>
+            </w:r>
+          </w:p>
+        </w:tc>
+      </w:tr>
+      <w:tr>
+        <w:tc>
+          <w:tcPr>
+            <w:tcW w:type="dxa" w:w="1234"/>
+          </w:tcPr>
+          <w:p>
+            <w:r>
+              <w:rPr>
+                <w:sz w:val="17"/>
+              </w:rPr>
+              <w:t>routing·labor</w:t>
+            </w:r>
+          </w:p>
+        </w:tc>
+        <w:tc>
+          <w:tcPr>
+            <w:tcW w:type="dxa" w:w="1234"/>
+          </w:tcPr>
+          <w:p>
+            <w:r>
+              <w:rPr>
+                <w:sz w:val="17"/>
+              </w:rPr>
+              <w:t>+0.44</w:t>
+            </w:r>
+          </w:p>
+        </w:tc>
+        <w:tc>
+          <w:tcPr>
+            <w:tcW w:type="dxa" w:w="1234"/>
+          </w:tcPr>
+          <w:p>
+            <w:r>
+              <w:rPr>
+                <w:sz w:val="17"/>
+              </w:rPr>
+              <w:t>+0.17</w:t>
+            </w:r>
+          </w:p>
+        </w:tc>
+        <w:tc>
+          <w:tcPr>
+            <w:tcW w:type="dxa" w:w="1234"/>
+          </w:tcPr>
+          <w:p>
+            <w:r>
+              <w:rPr>
+                <w:sz w:val="17"/>
+              </w:rPr>
+              <w:t>+0.06</w:t>
+            </w:r>
+          </w:p>
+        </w:tc>
+        <w:tc>
+          <w:tcPr>
+            <w:tcW w:type="dxa" w:w="1234"/>
+          </w:tcPr>
+          <w:p>
+            <w:r>
+              <w:rPr>
+                <w:sz w:val="17"/>
+              </w:rPr>
+              <w:t>-0.22</w:t>
+            </w:r>
+          </w:p>
+        </w:tc>
+        <w:tc>
+          <w:tcPr>
+            <w:tcW w:type="dxa" w:w="1234"/>
+          </w:tcPr>
+          <w:p>
+            <w:r>
+              <w:rPr>
+                <w:sz w:val="17"/>
+              </w:rPr>
+              <w:t>+0.10</w:t>
+            </w:r>
+          </w:p>
+        </w:tc>
+        <w:tc>
+          <w:tcPr>
+            <w:tcW w:type="dxa" w:w="1234"/>
+          </w:tcPr>
+          <w:p>
+            <w:r>
+              <w:rPr>
+                <w:sz w:val="17"/>
+              </w:rPr>
+              <w:t>+0.00</w:t>
+            </w:r>
+          </w:p>
+        </w:tc>
+      </w:tr>
+      <w:tr>
+        <w:tc>
+          <w:tcPr>
+            <w:tcW w:type="dxa" w:w="1234"/>
+          </w:tcPr>
+          <w:p>
+            <w:r>
+              <w:rPr>
+                <w:sz w:val="17"/>
+              </w:rPr>
+              <w:t>routing·deny</w:t>
+            </w:r>
+          </w:p>
+        </w:tc>
+        <w:tc>
+          <w:tcPr>
+            <w:tcW w:type="dxa" w:w="1234"/>
+          </w:tcPr>
+          <w:p>
+            <w:r>
+              <w:rPr>
+                <w:sz w:val="17"/>
+              </w:rPr>
+              <w:t>+0.23</w:t>
+            </w:r>
+          </w:p>
+        </w:tc>
+        <w:tc>
+          <w:tcPr>
+            <w:tcW w:type="dxa" w:w="1234"/>
+          </w:tcPr>
+          <w:p>
+            <w:r>
+              <w:rPr>
+                <w:sz w:val="17"/>
+              </w:rPr>
+              <w:t>+0.09</w:t>
+            </w:r>
+          </w:p>
+        </w:tc>
+        <w:tc>
+          <w:tcPr>
+            <w:tcW w:type="dxa" w:w="1234"/>
+          </w:tcPr>
+          <w:p>
+            <w:r>
+              <w:rPr>
+                <w:sz w:val="17"/>
+              </w:rPr>
+              <w:t>+0.08</w:t>
+            </w:r>
+          </w:p>
+        </w:tc>
+        <w:tc>
+          <w:tcPr>
+            <w:tcW w:type="dxa" w:w="1234"/>
+          </w:tcPr>
+          <w:p>
+            <w:r>
+              <w:rPr>
+                <w:sz w:val="17"/>
+              </w:rPr>
+              <w:t>-0.13</w:t>
+            </w:r>
+          </w:p>
+        </w:tc>
+        <w:tc>
+          <w:tcPr>
+            <w:tcW w:type="dxa" w:w="1234"/>
+          </w:tcPr>
+          <w:p>
+            <w:r>
+              <w:rPr>
+                <w:sz w:val="17"/>
+              </w:rPr>
+              <w:t>-0.02</w:t>
+            </w:r>
+          </w:p>
+        </w:tc>
+        <w:tc>
+          <w:tcPr>
+            <w:tcW w:type="dxa" w:w="1234"/>
+          </w:tcPr>
+          <w:p>
+            <w:r>
+              <w:rPr>
+                <w:sz w:val="17"/>
+              </w:rPr>
+              <w:t>-0.15</w:t>
+            </w:r>
+          </w:p>
+        </w:tc>
+      </w:tr>
+      <w:tr>
+        <w:tc>
+          <w:tcPr>
+            <w:tcW w:type="dxa" w:w="1234"/>
+          </w:tcPr>
+          <w:p>
+            <w:r>
+              <w:rPr>
+                <w:sz w:val="17"/>
+              </w:rPr>
+              <w:t>routing·apolitical</w:t>
+            </w:r>
+          </w:p>
+        </w:tc>
+        <w:tc>
+          <w:tcPr>
+            <w:tcW w:type="dxa" w:w="1234"/>
+          </w:tcPr>
+          <w:p>
+            <w:r>
+              <w:rPr>
+                <w:sz w:val="17"/>
+              </w:rPr>
+              <w:t>+0.36</w:t>
+            </w:r>
+          </w:p>
+        </w:tc>
+        <w:tc>
+          <w:tcPr>
+            <w:tcW w:type="dxa" w:w="1234"/>
+          </w:tcPr>
+          <w:p>
+            <w:r>
+              <w:rPr>
+                <w:sz w:val="17"/>
+              </w:rPr>
+              <w:t>+0.30</w:t>
+            </w:r>
+          </w:p>
+        </w:tc>
+        <w:tc>
+          <w:tcPr>
+            <w:tcW w:type="dxa" w:w="1234"/>
+          </w:tcPr>
+          <w:p>
+            <w:r>
+              <w:rPr>
+                <w:sz w:val="17"/>
+              </w:rPr>
+              <w:t>+0.19</w:t>
+            </w:r>
+          </w:p>
+        </w:tc>
+        <w:tc>
+          <w:tcPr>
+            <w:tcW w:type="dxa" w:w="1234"/>
+          </w:tcPr>
+          <w:p>
+            <w:r>
+              <w:rPr>
+                <w:sz w:val="17"/>
+              </w:rPr>
+              <w:t>-0.24</w:t>
+            </w:r>
+          </w:p>
+        </w:tc>
+        <w:tc>
+          <w:tcPr>
+            <w:tcW w:type="dxa" w:w="1234"/>
+          </w:tcPr>
+          <w:p>
+            <w:r>
+              <w:rPr>
+                <w:sz w:val="17"/>
+              </w:rPr>
+              <w:t>+0.11</w:t>
+            </w:r>
+          </w:p>
+        </w:tc>
+        <w:tc>
+          <w:tcPr>
+            <w:tcW w:type="dxa" w:w="1234"/>
+          </w:tcPr>
+          <w:p>
+            <w:r>
+              <w:rPr>
+                <w:sz w:val="17"/>
+              </w:rPr>
+              <w:t>-0.07</w:t>
+            </w:r>
+          </w:p>
+        </w:tc>
+      </w:tr>
+      <w:tr>
+        <w:tc>
+          <w:tcPr>
+            <w:tcW w:type="dxa" w:w="1234"/>
+          </w:tcPr>
+          <w:p>
+            <w:r>
+              <w:rPr>
+                <w:sz w:val="17"/>
+              </w:rPr>
+              <w:t>routing·neutral</w:t>
+            </w:r>
+          </w:p>
+        </w:tc>
+        <w:tc>
+          <w:tcPr>
+            <w:tcW w:type="dxa" w:w="1234"/>
+          </w:tcPr>
+          <w:p>
+            <w:r>
+              <w:rPr>
+                <w:sz w:val="17"/>
+              </w:rPr>
+              <w:t>+0.27</w:t>
+            </w:r>
+          </w:p>
+        </w:tc>
+        <w:tc>
+          <w:tcPr>
+            <w:tcW w:type="dxa" w:w="1234"/>
+          </w:tcPr>
+          <w:p>
+            <w:r>
+              <w:rPr>
+                <w:sz w:val="17"/>
+              </w:rPr>
+              <w:t>+0.03</w:t>
+            </w:r>
+          </w:p>
+        </w:tc>
+        <w:tc>
+          <w:tcPr>
+            <w:tcW w:type="dxa" w:w="1234"/>
+          </w:tcPr>
+          <w:p>
+            <w:r>
+              <w:rPr>
+                <w:sz w:val="17"/>
+              </w:rPr>
+              <w:t>+0.05</w:t>
+            </w:r>
+          </w:p>
+        </w:tc>
+        <w:tc>
+          <w:tcPr>
+            <w:tcW w:type="dxa" w:w="1234"/>
+          </w:tcPr>
+          <w:p>
+            <w:r>
+              <w:rPr>
+                <w:sz w:val="17"/>
+              </w:rPr>
+              <w:t>-0.04</w:t>
+            </w:r>
+          </w:p>
+        </w:tc>
+        <w:tc>
+          <w:tcPr>
+            <w:tcW w:type="dxa" w:w="1234"/>
+          </w:tcPr>
+          <w:p>
+            <w:r>
+              <w:rPr>
+                <w:sz w:val="17"/>
+              </w:rPr>
+              <w:t>+0.04</w:t>
+            </w:r>
+          </w:p>
+        </w:tc>
+        <w:tc>
+          <w:tcPr>
+            <w:tcW w:type="dxa" w:w="1234"/>
+          </w:tcPr>
+          <w:p>
+            <w:r>
+              <w:rPr>
+                <w:sz w:val="17"/>
+              </w:rPr>
+              <w:t>-0.27</w:t>
+            </w:r>
+          </w:p>
+        </w:tc>
+      </w:tr>
+    </w:tbl>
+    <w:p>
+      <w:pPr>
+        <w:pStyle w:val="Heading1"/>
+      </w:pPr>
+      <w:r>
+        <w:t>Methods &amp; the consistency re-eval</w:t>
+      </w:r>
+    </w:p>
+    <w:p>
+      <w:pPr>
+        <w:pStyle w:val="ListBullet"/>
+      </w:pPr>
+      <w:r>
+        <w:t>Qwen3.5-9B-instruct, Tinker LoRA rank 64 (α32). SDF = CPT loss all tokens (lr 5e-5); SFT = assistant-only, 850 picks, 1 epoch.</w:t>
+      </w:r>
+    </w:p>
+    <w:p>
+      <w:pPr>
+        <w:pStyle w:val="ListBullet"/>
+      </w:pPr>
+      <w:r>
+        <w:t>400 picks/state×issue (50 heldout items × 2 orders × 4 samples). Fig 2 CIs bootstrap over items.</w:t>
+      </w:r>
+    </w:p>
+    <w:p>
+      <w:pPr>
+        <w:pStyle w:val="ListBullet"/>
+      </w:pPr>
+      <w:r>
+        <w:t>The re-eval: build_datasets picked heldout with a process-randomized hash seed (PYTHONHASHSEED unpinned), so builds drew different splits and results were stitched across three builds (E1b base was on stale v2 abortion/immigration items). Fixed: pinned the seed, froze the v3 heldout, re-evaled every checkpoint onto it. Off-diagonal (all conclusions) is leakage-free; saturated diagonals may share train items but aren't a magnitude claim.</w:t>
+      </w:r>
+    </w:p>
+    <w:p>
+      <w:pPr>
+        <w:pStyle w:val="ListBullet"/>
+      </w:pPr>
+      <w:r>
+        <w:t>seed 0. Meta and H7 probes pending re-eval. abortion instrument-flagged.</w:t>
+      </w:r>
+    </w:p>
+    <w:p>
+      <w:pPr>
+        <w:pStyle w:val="ListBullet"/>
+      </w:pPr>
+      <w:r>
+        <w:t>Code, raw JSON, assemblers and plotters in the repo; preregs PREREG_E1A_MATRIX.md, PREREG_E1B_PILOT.md.</w:t>
       </w:r>
     </w:p>
     <w:sectPr>

</xml_diff>

<commit_message>
parser: pick-judge returns unresolved on refusals; report says why abortion is excluded
The Sonnet pick-judge used a weak "which did it pick?" prompt on only 500 chars, so it
sometimes coded a refusal ("as an AI I don't have views, I can't choose (a)/(b)") as a
pick. Tightened the prompt to return 'n' on any decline/hedge/no-commit, and gave it 1400
chars so a real pick after a disclaimer is still seen. (Effect on numbers is minor and
needs a re-eval to apply; the dominant abortion signal is unaffected.)

Replaced the vague "instrument-flagged/cursed" language with the actual reason: the base
model refuses the abortion A/B ~86% of the time (vs 35-64% elsewhere), so abortion's rate
rests on ~57 of 400 picks and is excluded as unreliable. Updated e1b_report.html + the
docx.

Co-Authored-By: Claude Opus 4.8 <noreply@anthropic.com>
Claude-Session: https://claude.ai/code/session_012JUK9KKbT5kVQUf3uyuFwL
</commit_message>
<xml_diff>
--- a/results/PLURIBUS_E1b_report.docx
+++ b/results/PLURIBUS_E1b_report.docx
@@ -1866,7 +1866,7 @@
           <w:b w:val="0"/>
           <w:i/>
         </w:rPr>
-        <w:t>abortion is the most reversal-prone column (opposite in 4 of 12 single-issue rows); instrument-flagged and excluded from the E1b routing conclusions.</w:t>
+        <w:t>abortion is excluded from the E1b routing conclusions: the base model refuses to pick a side on abortion ~86% of the time (vs 35-64% on other issues), so its rate rests on ~57 of 400 picks — too noisy and selection-biased to interpret. (It is also the most reversal-prone column, opposite in 4 of 12 rows.)</w:t>
       </w:r>
     </w:p>
     <w:p>
@@ -3973,7 +3973,7 @@
         <w:pStyle w:val="ListBullet"/>
       </w:pPr>
       <w:r>
-        <w:t>seed 0. Meta and H7 probes pending re-eval. abortion instrument-flagged.</w:t>
+        <w:t>seed 0. Meta and H7 probes pending re-eval. abortion excluded (base refuses ~86% of those picks). Parser note: the Sonnet pick-judge was tightened to return 'unresolved' on refusals (it occasionally over-read a refusal as a pick); effect on non-abortion numbers is minor.</w:t>
       </w:r>
     </w:p>
     <w:p>

</xml_diff>